<commit_message>
Fix camera startup and optimize dashboard UI
</commit_message>
<xml_diff>
--- a/Documentation/ProjectOverview.docx
+++ b/Documentation/ProjectOverview.docx
@@ -107,7 +107,7 @@
     </w:p>
     <w:p>
       <w:pPr>
-        <w:pStyle w:val="10"/>
+        <w:pStyle w:val="11"/>
         <w:keepNext w:val="0"/>
         <w:keepLines w:val="0"/>
         <w:widowControl/>
@@ -177,7 +177,7 @@
     </w:p>
     <w:p>
       <w:pPr>
-        <w:pStyle w:val="10"/>
+        <w:pStyle w:val="11"/>
         <w:keepNext w:val="0"/>
         <w:keepLines w:val="0"/>
         <w:widowControl/>
@@ -197,7 +197,7 @@
     </w:p>
     <w:p>
       <w:pPr>
-        <w:pStyle w:val="10"/>
+        <w:pStyle w:val="11"/>
         <w:keepNext w:val="0"/>
         <w:keepLines w:val="0"/>
         <w:widowControl/>
@@ -216,14 +216,14 @@
       </w:r>
       <w:r>
         <w:rPr>
-          <w:rStyle w:val="11"/>
+          <w:rStyle w:val="12"/>
           <w:rFonts w:hint="default" w:ascii="Times New Roman" w:hAnsi="Times New Roman" w:cs="Times New Roman"/>
         </w:rPr>
         <w:t>A</w:t>
       </w:r>
       <w:r>
         <w:rPr>
-          <w:rStyle w:val="11"/>
+          <w:rStyle w:val="12"/>
           <w:rFonts w:hint="default" w:cs="Times New Roman"/>
           <w:lang w:val="en-ZA"/>
         </w:rPr>
@@ -231,7 +231,7 @@
       </w:r>
       <w:r>
         <w:rPr>
-          <w:rStyle w:val="11"/>
+          <w:rStyle w:val="12"/>
           <w:rFonts w:hint="default" w:ascii="Times New Roman" w:hAnsi="Times New Roman" w:cs="Times New Roman"/>
         </w:rPr>
         <w:t xml:space="preserve">utomated Fruit Sorting </w:t>
@@ -404,7 +404,7 @@
     </w:p>
     <w:p>
       <w:pPr>
-        <w:pStyle w:val="10"/>
+        <w:pStyle w:val="11"/>
         <w:keepNext w:val="0"/>
         <w:keepLines w:val="0"/>
         <w:widowControl/>
@@ -419,7 +419,7 @@
     </w:p>
     <w:p>
       <w:pPr>
-        <w:pStyle w:val="10"/>
+        <w:pStyle w:val="11"/>
         <w:keepNext w:val="0"/>
         <w:keepLines w:val="0"/>
         <w:widowControl/>
@@ -433,7 +433,7 @@
     </w:p>
     <w:p>
       <w:pPr>
-        <w:pStyle w:val="10"/>
+        <w:pStyle w:val="11"/>
         <w:keepNext w:val="0"/>
         <w:keepLines w:val="0"/>
         <w:widowControl/>
@@ -447,7 +447,7 @@
     </w:p>
     <w:p>
       <w:pPr>
-        <w:pStyle w:val="10"/>
+        <w:pStyle w:val="11"/>
         <w:keepNext w:val="0"/>
         <w:keepLines w:val="0"/>
         <w:widowControl/>
@@ -461,7 +461,7 @@
     </w:p>
     <w:p>
       <w:pPr>
-        <w:pStyle w:val="10"/>
+        <w:pStyle w:val="11"/>
         <w:keepNext w:val="0"/>
         <w:keepLines w:val="0"/>
         <w:widowControl/>
@@ -733,16 +733,16 @@
     </w:p>
     <w:p>
       <w:pPr>
-        <w:pStyle w:val="10"/>
-        <w:keepNext w:val="0"/>
-        <w:keepLines w:val="0"/>
-        <w:widowControl/>
-        <w:suppressLineNumbers w:val="0"/>
-      </w:pPr>
-    </w:p>
-    <w:p>
-      <w:pPr>
-        <w:pStyle w:val="10"/>
+        <w:pStyle w:val="11"/>
+        <w:keepNext w:val="0"/>
+        <w:keepLines w:val="0"/>
+        <w:widowControl/>
+        <w:suppressLineNumbers w:val="0"/>
+      </w:pPr>
+    </w:p>
+    <w:p>
+      <w:pPr>
+        <w:pStyle w:val="11"/>
         <w:keepNext w:val="0"/>
         <w:keepLines w:val="0"/>
         <w:widowControl/>
@@ -1357,7 +1357,7 @@
       <w:pPr>
         <w:numPr>
           <w:ilvl w:val="0"/>
-          <w:numId w:val="1"/>
+          <w:numId w:val="2"/>
         </w:numPr>
         <w:bidi w:val="0"/>
         <w:rPr>
@@ -1616,7 +1616,7 @@
         <w:widowControl/>
         <w:numPr>
           <w:ilvl w:val="0"/>
-          <w:numId w:val="2"/>
+          <w:numId w:val="3"/>
         </w:numPr>
         <w:suppressLineNumbers w:val="0"/>
         <w:pBdr>
@@ -1970,7 +1970,7 @@
     </w:p>
     <w:p>
       <w:pPr>
-        <w:pStyle w:val="10"/>
+        <w:pStyle w:val="11"/>
         <w:keepNext w:val="0"/>
         <w:keepLines w:val="0"/>
         <w:widowControl/>
@@ -1999,7 +1999,7 @@
     </w:p>
     <w:p>
       <w:pPr>
-        <w:pStyle w:val="10"/>
+        <w:pStyle w:val="11"/>
         <w:keepNext w:val="0"/>
         <w:keepLines w:val="0"/>
         <w:widowControl/>
@@ -2033,7 +2033,7 @@
     </w:p>
     <w:p>
       <w:pPr>
-        <w:pStyle w:val="10"/>
+        <w:pStyle w:val="11"/>
         <w:keepNext w:val="0"/>
         <w:keepLines w:val="0"/>
         <w:widowControl/>
@@ -2053,7 +2053,7 @@
     </w:p>
     <w:p>
       <w:pPr>
-        <w:pStyle w:val="10"/>
+        <w:pStyle w:val="11"/>
         <w:keepNext w:val="0"/>
         <w:keepLines w:val="0"/>
         <w:widowControl/>
@@ -2073,7 +2073,7 @@
     </w:p>
     <w:p>
       <w:pPr>
-        <w:pStyle w:val="10"/>
+        <w:pStyle w:val="11"/>
         <w:keepNext w:val="0"/>
         <w:keepLines w:val="0"/>
         <w:widowControl/>
@@ -2097,7 +2097,7 @@
     </w:p>
     <w:p>
       <w:pPr>
-        <w:pStyle w:val="10"/>
+        <w:pStyle w:val="11"/>
         <w:keepNext w:val="0"/>
         <w:keepLines w:val="0"/>
         <w:widowControl/>
@@ -2126,7 +2126,7 @@
     </w:p>
     <w:p>
       <w:pPr>
-        <w:pStyle w:val="10"/>
+        <w:pStyle w:val="11"/>
         <w:keepNext w:val="0"/>
         <w:keepLines w:val="0"/>
         <w:widowControl/>
@@ -2161,7 +2161,7 @@
     </w:p>
     <w:p>
       <w:pPr>
-        <w:pStyle w:val="10"/>
+        <w:pStyle w:val="11"/>
         <w:keepNext w:val="0"/>
         <w:keepLines w:val="0"/>
         <w:widowControl/>
@@ -2210,7 +2210,7 @@
     </w:p>
     <w:p>
       <w:pPr>
-        <w:pStyle w:val="10"/>
+        <w:pStyle w:val="11"/>
         <w:keepNext w:val="0"/>
         <w:keepLines w:val="0"/>
         <w:widowControl/>
@@ -2261,7 +2261,7 @@
     </w:p>
     <w:p>
       <w:pPr>
-        <w:pStyle w:val="10"/>
+        <w:pStyle w:val="11"/>
         <w:keepNext w:val="0"/>
         <w:keepLines w:val="0"/>
         <w:widowControl/>
@@ -2307,7 +2307,7 @@
     </w:p>
     <w:p>
       <w:pPr>
-        <w:pStyle w:val="10"/>
+        <w:pStyle w:val="11"/>
         <w:keepNext w:val="0"/>
         <w:keepLines w:val="0"/>
         <w:widowControl/>
@@ -2367,7 +2367,7 @@
     </w:p>
     <w:p>
       <w:pPr>
-        <w:pStyle w:val="10"/>
+        <w:pStyle w:val="11"/>
         <w:keepNext w:val="0"/>
         <w:keepLines w:val="0"/>
         <w:widowControl/>
@@ -2444,7 +2444,7 @@
       </w:pPr>
       <w:r>
         <w:rPr>
-          <w:rStyle w:val="11"/>
+          <w:rStyle w:val="12"/>
           <w:rFonts w:hint="default" w:ascii="Times New Roman" w:hAnsi="Times New Roman" w:eastAsia="sans-serif" w:cs="Times New Roman"/>
           <w:b/>
           <w:bCs/>
@@ -2768,7 +2768,7 @@
       </w:pPr>
       <w:r>
         <w:rPr>
-          <w:rStyle w:val="11"/>
+          <w:rStyle w:val="12"/>
           <w:rFonts w:hint="default" w:ascii="Times New Roman" w:hAnsi="Times New Roman" w:eastAsia="sans-serif" w:cs="Times New Roman"/>
           <w:b/>
           <w:bCs/>
@@ -3063,7 +3063,7 @@
     </w:p>
     <w:p>
       <w:pPr>
-        <w:pStyle w:val="10"/>
+        <w:pStyle w:val="11"/>
         <w:keepNext w:val="0"/>
         <w:keepLines w:val="0"/>
         <w:widowControl/>
@@ -3105,7 +3105,7 @@
     </w:p>
     <w:p>
       <w:pPr>
-        <w:pStyle w:val="10"/>
+        <w:pStyle w:val="11"/>
         <w:keepNext w:val="0"/>
         <w:keepLines w:val="0"/>
         <w:widowControl/>
@@ -3147,7 +3147,7 @@
     </w:p>
     <w:p>
       <w:pPr>
-        <w:pStyle w:val="10"/>
+        <w:pStyle w:val="11"/>
         <w:keepNext w:val="0"/>
         <w:keepLines w:val="0"/>
         <w:widowControl/>
@@ -3161,7 +3161,7 @@
     </w:p>
     <w:p>
       <w:pPr>
-        <w:pStyle w:val="10"/>
+        <w:pStyle w:val="11"/>
         <w:keepNext w:val="0"/>
         <w:keepLines w:val="0"/>
         <w:widowControl/>
@@ -3188,7 +3188,7 @@
     </w:p>
     <w:p>
       <w:pPr>
-        <w:pStyle w:val="10"/>
+        <w:pStyle w:val="11"/>
         <w:keepNext w:val="0"/>
         <w:keepLines w:val="0"/>
         <w:widowControl/>
@@ -3279,7 +3279,7 @@
     </w:p>
     <w:p>
       <w:pPr>
-        <w:pStyle w:val="10"/>
+        <w:pStyle w:val="11"/>
         <w:keepNext w:val="0"/>
         <w:keepLines w:val="0"/>
         <w:widowControl/>
@@ -3339,7 +3339,7 @@
         <w:widowControl/>
         <w:numPr>
           <w:ilvl w:val="0"/>
-          <w:numId w:val="3"/>
+          <w:numId w:val="4"/>
         </w:numPr>
         <w:suppressLineNumbers w:val="0"/>
         <w:spacing w:before="0" w:beforeAutospacing="0" w:after="0" w:afterAutospacing="1" w:line="12" w:lineRule="atLeast"/>
@@ -3353,7 +3353,7 @@
     </w:p>
     <w:p>
       <w:pPr>
-        <w:pStyle w:val="10"/>
+        <w:pStyle w:val="11"/>
         <w:keepNext w:val="0"/>
         <w:keepLines w:val="0"/>
         <w:widowControl/>
@@ -3418,7 +3418,7 @@
     </w:p>
     <w:p>
       <w:pPr>
-        <w:pStyle w:val="10"/>
+        <w:pStyle w:val="11"/>
         <w:keepNext w:val="0"/>
         <w:keepLines w:val="0"/>
         <w:widowControl/>
@@ -3443,7 +3443,7 @@
     </w:p>
     <w:p>
       <w:pPr>
-        <w:pStyle w:val="10"/>
+        <w:pStyle w:val="11"/>
         <w:keepNext w:val="0"/>
         <w:keepLines w:val="0"/>
         <w:widowControl/>
@@ -3496,7 +3496,7 @@
     </w:p>
     <w:p>
       <w:pPr>
-        <w:pStyle w:val="10"/>
+        <w:pStyle w:val="11"/>
         <w:keepNext w:val="0"/>
         <w:keepLines w:val="0"/>
         <w:widowControl/>
@@ -3531,7 +3531,7 @@
     </w:p>
     <w:p>
       <w:pPr>
-        <w:pStyle w:val="10"/>
+        <w:pStyle w:val="11"/>
         <w:keepNext w:val="0"/>
         <w:keepLines w:val="0"/>
         <w:widowControl/>
@@ -3589,7 +3589,7 @@
     </w:p>
     <w:p>
       <w:pPr>
-        <w:pStyle w:val="10"/>
+        <w:pStyle w:val="11"/>
         <w:keepNext w:val="0"/>
         <w:keepLines w:val="0"/>
         <w:widowControl/>
@@ -3613,7 +3613,7 @@
     </w:p>
     <w:p>
       <w:pPr>
-        <w:pStyle w:val="10"/>
+        <w:pStyle w:val="11"/>
         <w:keepNext w:val="0"/>
         <w:keepLines w:val="0"/>
         <w:widowControl/>
@@ -3665,7 +3665,7 @@
     </w:p>
     <w:p>
       <w:pPr>
-        <w:pStyle w:val="10"/>
+        <w:pStyle w:val="11"/>
         <w:keepNext w:val="0"/>
         <w:keepLines w:val="0"/>
         <w:widowControl/>
@@ -3699,7 +3699,7 @@
     </w:p>
     <w:p>
       <w:pPr>
-        <w:pStyle w:val="10"/>
+        <w:pStyle w:val="11"/>
         <w:keepNext w:val="0"/>
         <w:keepLines w:val="0"/>
         <w:widowControl/>
@@ -3748,7 +3748,7 @@
     </w:p>
     <w:p>
       <w:pPr>
-        <w:pStyle w:val="10"/>
+        <w:pStyle w:val="11"/>
         <w:keepNext w:val="0"/>
         <w:keepLines w:val="0"/>
         <w:widowControl/>
@@ -3772,7 +3772,7 @@
     </w:p>
     <w:p>
       <w:pPr>
-        <w:pStyle w:val="10"/>
+        <w:pStyle w:val="11"/>
         <w:keepNext w:val="0"/>
         <w:keepLines w:val="0"/>
         <w:widowControl/>
@@ -3824,7 +3824,7 @@
     </w:p>
     <w:p>
       <w:pPr>
-        <w:pStyle w:val="10"/>
+        <w:pStyle w:val="11"/>
         <w:keepNext w:val="0"/>
         <w:keepLines w:val="0"/>
         <w:widowControl/>
@@ -3858,7 +3858,7 @@
     </w:p>
     <w:p>
       <w:pPr>
-        <w:pStyle w:val="10"/>
+        <w:pStyle w:val="11"/>
         <w:keepNext w:val="0"/>
         <w:keepLines w:val="0"/>
         <w:widowControl/>
@@ -3886,7 +3886,7 @@
     </w:p>
     <w:p>
       <w:pPr>
-        <w:pStyle w:val="10"/>
+        <w:pStyle w:val="11"/>
         <w:keepNext w:val="0"/>
         <w:keepLines w:val="0"/>
         <w:widowControl/>
@@ -3920,7 +3920,7 @@
     </w:p>
     <w:p>
       <w:pPr>
-        <w:pStyle w:val="10"/>
+        <w:pStyle w:val="11"/>
         <w:keepNext w:val="0"/>
         <w:keepLines w:val="0"/>
         <w:widowControl/>
@@ -3954,7 +3954,7 @@
     </w:p>
     <w:p>
       <w:pPr>
-        <w:pStyle w:val="10"/>
+        <w:pStyle w:val="11"/>
         <w:keepNext w:val="0"/>
         <w:keepLines w:val="0"/>
         <w:widowControl/>
@@ -3970,7 +3970,7 @@
     </w:p>
     <w:p>
       <w:pPr>
-        <w:pStyle w:val="10"/>
+        <w:pStyle w:val="11"/>
         <w:keepNext w:val="0"/>
         <w:keepLines w:val="0"/>
         <w:widowControl/>
@@ -4002,7 +4002,7 @@
     </w:p>
     <w:p>
       <w:pPr>
-        <w:pStyle w:val="10"/>
+        <w:pStyle w:val="11"/>
         <w:keepNext w:val="0"/>
         <w:keepLines w:val="0"/>
         <w:widowControl/>
@@ -4056,7 +4056,7 @@
     </w:p>
     <w:p>
       <w:pPr>
-        <w:pStyle w:val="10"/>
+        <w:pStyle w:val="11"/>
         <w:keepNext w:val="0"/>
         <w:keepLines w:val="0"/>
         <w:widowControl/>
@@ -4093,7 +4093,6 @@
           <w:kern w:val="0"/>
           <w:sz w:val="24"/>
           <w:szCs w:val="24"/>
-          <w:bdr w:val="none" w:color="1F1F1F" w:sz="0" w:space="0"/>
           <w:lang w:val="en-US" w:eastAsia="zh-CN" w:bidi="ar"/>
         </w:rPr>
         <w:t xml:space="preserve">This UML Use Case Diagram illustrates the functional boundary and interactions of your </w:t>
@@ -4107,7 +4106,6 @@
           <w:kern w:val="0"/>
           <w:sz w:val="24"/>
           <w:szCs w:val="24"/>
-          <w:bdr w:val="none" w:color="1F1F1F" w:sz="0" w:space="0"/>
           <w:lang w:val="en-US" w:eastAsia="zh-CN" w:bidi="ar"/>
         </w:rPr>
         <w:t>Fruit Grading System</w:t>
@@ -4119,7 +4117,6 @@
           <w:kern w:val="0"/>
           <w:sz w:val="24"/>
           <w:szCs w:val="24"/>
-          <w:bdr w:val="none" w:color="1F1F1F" w:sz="0" w:space="0"/>
           <w:lang w:val="en-US" w:eastAsia="zh-CN" w:bidi="ar"/>
         </w:rPr>
         <w:t>. It organizes the system's capabilities into interactions between external actors (users or automated secondary systems) and the internal use cases (ovals).</w:t>
@@ -4131,7 +4128,6 @@
           <w:kern w:val="0"/>
           <w:sz w:val="24"/>
           <w:szCs w:val="24"/>
-          <w:bdr w:val="none" w:color="auto" w:sz="0" w:space="0"/>
           <w:lang w:val="en-US" w:eastAsia="zh-CN" w:bidi="ar"/>
         </w:rPr>
         <w:t xml:space="preserve"> </w:t>
@@ -4184,7 +4180,6 @@
         <w:rPr>
           <w:rFonts w:hint="default" w:ascii="Times New Roman" w:hAnsi="Times New Roman" w:eastAsia="sans-serif" w:cs="Times New Roman"/>
           <w:color w:val="1F1F1F"/>
-          <w:bdr w:val="none" w:color="1F1F1F" w:sz="0" w:space="0"/>
         </w:rPr>
         <w:t>1. System Actors</w:t>
       </w:r>
@@ -4196,7 +4191,7 @@
         <w:widowControl/>
         <w:numPr>
           <w:ilvl w:val="0"/>
-          <w:numId w:val="4"/>
+          <w:numId w:val="5"/>
         </w:numPr>
         <w:suppressLineNumbers w:val="0"/>
         <w:pBdr>
@@ -4244,7 +4239,6 @@
           <w:kern w:val="0"/>
           <w:sz w:val="24"/>
           <w:szCs w:val="24"/>
-          <w:bdr w:val="none" w:color="1F1F1F" w:sz="0" w:space="0"/>
           <w:lang w:val="en-US" w:eastAsia="zh-CN" w:bidi="ar"/>
         </w:rPr>
         <w:t>Line Operator (Human Actor):</w:t>
@@ -4256,7 +4250,6 @@
           <w:kern w:val="0"/>
           <w:sz w:val="24"/>
           <w:szCs w:val="24"/>
-          <w:bdr w:val="none" w:color="1F1F1F" w:sz="0" w:space="0"/>
           <w:lang w:val="en-US" w:eastAsia="zh-CN" w:bidi="ar"/>
         </w:rPr>
         <w:t xml:space="preserve"> The frontline worker</w:t>
@@ -4268,7 +4261,6 @@
           <w:kern w:val="0"/>
           <w:sz w:val="24"/>
           <w:szCs w:val="24"/>
-          <w:bdr w:val="none" w:color="1F1F1F" w:sz="0" w:space="0"/>
           <w:lang w:val="en-ZA" w:eastAsia="zh-CN" w:bidi="ar"/>
         </w:rPr>
         <w:t xml:space="preserve"> is </w:t>
@@ -4280,7 +4272,6 @@
           <w:kern w:val="0"/>
           <w:sz w:val="24"/>
           <w:szCs w:val="24"/>
-          <w:bdr w:val="none" w:color="1F1F1F" w:sz="0" w:space="0"/>
           <w:lang w:val="en-US" w:eastAsia="zh-CN" w:bidi="ar"/>
         </w:rPr>
         <w:t xml:space="preserve"> monitoring</w:t>
@@ -4292,7 +4283,6 @@
           <w:kern w:val="0"/>
           <w:sz w:val="24"/>
           <w:szCs w:val="24"/>
-          <w:bdr w:val="none" w:color="1F1F1F" w:sz="0" w:space="0"/>
           <w:lang w:val="en-ZA" w:eastAsia="zh-CN" w:bidi="ar"/>
         </w:rPr>
         <w:t xml:space="preserve"> the</w:t>
@@ -4304,7 +4294,6 @@
           <w:kern w:val="0"/>
           <w:sz w:val="24"/>
           <w:szCs w:val="24"/>
-          <w:bdr w:val="none" w:color="1F1F1F" w:sz="0" w:space="0"/>
           <w:lang w:val="en-US" w:eastAsia="zh-CN" w:bidi="ar"/>
         </w:rPr>
         <w:t xml:space="preserve"> physical conveyor operations.</w:t>
@@ -4316,7 +4305,6 @@
           <w:kern w:val="0"/>
           <w:sz w:val="24"/>
           <w:szCs w:val="24"/>
-          <w:bdr w:val="none" w:color="auto" w:sz="0" w:space="0"/>
           <w:lang w:val="en-US" w:eastAsia="zh-CN" w:bidi="ar"/>
         </w:rPr>
         <w:t xml:space="preserve"> </w:t>
@@ -4352,7 +4340,6 @@
           <w:kern w:val="0"/>
           <w:sz w:val="24"/>
           <w:szCs w:val="24"/>
-          <w:bdr w:val="none" w:color="1F1F1F" w:sz="0" w:space="0"/>
           <w:lang w:val="en-US" w:eastAsia="zh-CN" w:bidi="ar"/>
         </w:rPr>
         <w:t>System Admin / QA (Human Actor):</w:t>
@@ -4364,7 +4351,6 @@
           <w:kern w:val="0"/>
           <w:sz w:val="24"/>
           <w:szCs w:val="24"/>
-          <w:bdr w:val="none" w:color="1F1F1F" w:sz="0" w:space="0"/>
           <w:lang w:val="en-US" w:eastAsia="zh-CN" w:bidi="ar"/>
         </w:rPr>
         <w:t xml:space="preserve"> The technical or quality assurance supervisor manag</w:t>
@@ -4376,7 +4362,6 @@
           <w:kern w:val="0"/>
           <w:sz w:val="24"/>
           <w:szCs w:val="24"/>
-          <w:bdr w:val="none" w:color="1F1F1F" w:sz="0" w:space="0"/>
           <w:lang w:val="en-ZA" w:eastAsia="zh-CN" w:bidi="ar"/>
         </w:rPr>
         <w:t>es the</w:t>
@@ -4388,7 +4373,6 @@
           <w:kern w:val="0"/>
           <w:sz w:val="24"/>
           <w:szCs w:val="24"/>
-          <w:bdr w:val="none" w:color="1F1F1F" w:sz="0" w:space="0"/>
           <w:lang w:val="en-US" w:eastAsia="zh-CN" w:bidi="ar"/>
         </w:rPr>
         <w:t xml:space="preserve"> system settings and model performance.</w:t>
@@ -4400,7 +4384,6 @@
           <w:kern w:val="0"/>
           <w:sz w:val="24"/>
           <w:szCs w:val="24"/>
-          <w:bdr w:val="none" w:color="auto" w:sz="0" w:space="0"/>
           <w:lang w:val="en-US" w:eastAsia="zh-CN" w:bidi="ar"/>
         </w:rPr>
         <w:t xml:space="preserve"> </w:t>
@@ -4412,6 +4395,7 @@
         <w:keepLines w:val="0"/>
         <w:widowControl/>
         <w:numPr>
+          <w:ilvl w:val="0"/>
           <w:numId w:val="0"/>
         </w:numPr>
         <w:suppressLineNumbers w:val="0"/>
@@ -4460,7 +4444,6 @@
           <w:kern w:val="0"/>
           <w:sz w:val="24"/>
           <w:szCs w:val="24"/>
-          <w:bdr w:val="none" w:color="1F1F1F" w:sz="0" w:space="0"/>
           <w:lang w:val="en-US" w:eastAsia="zh-CN" w:bidi="ar"/>
         </w:rPr>
         <w:t>CV / AI Subsystem (Secondary / Machine Actor):</w:t>
@@ -4472,7 +4455,6 @@
           <w:kern w:val="0"/>
           <w:sz w:val="24"/>
           <w:szCs w:val="24"/>
-          <w:bdr w:val="none" w:color="1F1F1F" w:sz="0" w:space="0"/>
           <w:lang w:val="en-US" w:eastAsia="zh-CN" w:bidi="ar"/>
         </w:rPr>
         <w:t xml:space="preserve"> The automated vision pipeline (running on your Raspberry Pi 4) executing image analysis algorithms.</w:t>
@@ -4484,7 +4466,6 @@
           <w:kern w:val="0"/>
           <w:sz w:val="24"/>
           <w:szCs w:val="24"/>
-          <w:bdr w:val="none" w:color="auto" w:sz="0" w:space="0"/>
           <w:lang w:val="en-US" w:eastAsia="zh-CN" w:bidi="ar"/>
         </w:rPr>
         <w:t xml:space="preserve"> </w:t>
@@ -4497,7 +4478,7 @@
         <w:widowControl/>
         <w:numPr>
           <w:ilvl w:val="0"/>
-          <w:numId w:val="4"/>
+          <w:numId w:val="5"/>
         </w:numPr>
         <w:suppressLineNumbers w:val="0"/>
         <w:pBdr>
@@ -4540,7 +4521,6 @@
         <w:rPr>
           <w:rFonts w:hint="default" w:ascii="Times New Roman" w:hAnsi="Times New Roman" w:eastAsia="sans-serif" w:cs="Times New Roman"/>
           <w:color w:val="1F1F1F"/>
-          <w:bdr w:val="none" w:color="1F1F1F" w:sz="0" w:space="0"/>
         </w:rPr>
         <w:t xml:space="preserve">2. Breakdown of Use Cases </w:t>
       </w:r>
@@ -4572,7 +4552,6 @@
           <w:b/>
           <w:bCs/>
           <w:color w:val="1F1F1F"/>
-          <w:bdr w:val="none" w:color="1F1F1F" w:sz="0" w:space="0"/>
         </w:rPr>
         <w:t>Line Operator Capabilities</w:t>
       </w:r>
@@ -4607,7 +4586,6 @@
           <w:kern w:val="0"/>
           <w:sz w:val="24"/>
           <w:szCs w:val="24"/>
-          <w:bdr w:val="none" w:color="1F1F1F" w:sz="0" w:space="0"/>
           <w:lang w:val="en-US" w:eastAsia="zh-CN" w:bidi="ar"/>
         </w:rPr>
         <w:t>Capture Fruit Image:</w:t>
@@ -4619,7 +4597,6 @@
           <w:kern w:val="0"/>
           <w:sz w:val="24"/>
           <w:szCs w:val="24"/>
-          <w:bdr w:val="none" w:color="1F1F1F" w:sz="0" w:space="0"/>
           <w:lang w:val="en-US" w:eastAsia="zh-CN" w:bidi="ar"/>
         </w:rPr>
         <w:t xml:space="preserve"> Triggers or monitors image acquisition from the camera.</w:t>
@@ -4631,7 +4608,6 @@
           <w:kern w:val="0"/>
           <w:sz w:val="24"/>
           <w:szCs w:val="24"/>
-          <w:bdr w:val="none" w:color="auto" w:sz="0" w:space="0"/>
           <w:lang w:val="en-US" w:eastAsia="zh-CN" w:bidi="ar"/>
         </w:rPr>
         <w:t xml:space="preserve"> </w:t>
@@ -4667,7 +4643,6 @@
           <w:kern w:val="0"/>
           <w:sz w:val="24"/>
           <w:szCs w:val="24"/>
-          <w:bdr w:val="none" w:color="1F1F1F" w:sz="0" w:space="0"/>
           <w:lang w:val="en-US" w:eastAsia="zh-CN" w:bidi="ar"/>
         </w:rPr>
         <w:t>View Real-Time Results:</w:t>
@@ -4679,7 +4654,6 @@
           <w:kern w:val="0"/>
           <w:sz w:val="24"/>
           <w:szCs w:val="24"/>
-          <w:bdr w:val="none" w:color="1F1F1F" w:sz="0" w:space="0"/>
           <w:lang w:val="en-US" w:eastAsia="zh-CN" w:bidi="ar"/>
         </w:rPr>
         <w:t xml:space="preserve"> Displays live video feeds, predicted fruit grades, defect overlays, and throughput metrics.</w:t>
@@ -4691,7 +4665,6 @@
           <w:kern w:val="0"/>
           <w:sz w:val="24"/>
           <w:szCs w:val="24"/>
-          <w:bdr w:val="none" w:color="auto" w:sz="0" w:space="0"/>
           <w:lang w:val="en-US" w:eastAsia="zh-CN" w:bidi="ar"/>
         </w:rPr>
         <w:t xml:space="preserve"> </w:t>
@@ -4727,7 +4700,6 @@
           <w:kern w:val="0"/>
           <w:sz w:val="24"/>
           <w:szCs w:val="24"/>
-          <w:bdr w:val="none" w:color="1F1F1F" w:sz="0" w:space="0"/>
           <w:lang w:val="en-US" w:eastAsia="zh-CN" w:bidi="ar"/>
         </w:rPr>
         <w:t>Override Grade:</w:t>
@@ -4739,33 +4711,17 @@
           <w:kern w:val="0"/>
           <w:sz w:val="24"/>
           <w:szCs w:val="24"/>
-          <w:bdr w:val="none" w:color="1F1F1F" w:sz="0" w:space="0"/>
-          <w:lang w:val="en-US" w:eastAsia="zh-CN" w:bidi="ar"/>
-        </w:rPr>
-        <w:t xml:space="preserve"> Allow</w:t>
-      </w:r>
-      <w:bookmarkStart w:id="0" w:name="_GoBack"/>
-      <w:bookmarkEnd w:id="0"/>
-      <w:r>
-        <w:rPr>
-          <w:rFonts w:hint="default" w:ascii="Times New Roman" w:hAnsi="Times New Roman" w:eastAsia="sans-serif" w:cs="Times New Roman"/>
-          <w:color w:val="1F1F1F"/>
-          <w:kern w:val="0"/>
-          <w:sz w:val="24"/>
-          <w:szCs w:val="24"/>
-          <w:bdr w:val="none" w:color="1F1F1F" w:sz="0" w:space="0"/>
-          <w:lang w:val="en-US" w:eastAsia="zh-CN" w:bidi="ar"/>
-        </w:rPr>
-        <w:t>s manual intervention to reclassify a fruit if the AI misclassifies it.</w:t>
-      </w:r>
-      <w:r>
-        <w:rPr>
-          <w:rFonts w:hint="default" w:ascii="Times New Roman" w:hAnsi="Times New Roman" w:eastAsia="sans-serif" w:cs="Times New Roman"/>
-          <w:color w:val="1F1F1F"/>
-          <w:kern w:val="0"/>
-          <w:sz w:val="24"/>
-          <w:szCs w:val="24"/>
-          <w:bdr w:val="none" w:color="auto" w:sz="0" w:space="0"/>
+          <w:lang w:val="en-US" w:eastAsia="zh-CN" w:bidi="ar"/>
+        </w:rPr>
+        <w:t xml:space="preserve"> Allows manual intervention to reclassify a fruit if the AI misclassifies it.</w:t>
+      </w:r>
+      <w:r>
+        <w:rPr>
+          <w:rFonts w:hint="default" w:ascii="Times New Roman" w:hAnsi="Times New Roman" w:eastAsia="sans-serif" w:cs="Times New Roman"/>
+          <w:color w:val="1F1F1F"/>
+          <w:kern w:val="0"/>
+          <w:sz w:val="24"/>
+          <w:szCs w:val="24"/>
           <w:lang w:val="en-US" w:eastAsia="zh-CN" w:bidi="ar"/>
         </w:rPr>
         <w:t xml:space="preserve"> </w:t>
@@ -4801,7 +4757,6 @@
           <w:kern w:val="0"/>
           <w:sz w:val="24"/>
           <w:szCs w:val="24"/>
-          <w:bdr w:val="none" w:color="1F1F1F" w:sz="0" w:space="0"/>
           <w:lang w:val="en-US" w:eastAsia="zh-CN" w:bidi="ar"/>
         </w:rPr>
         <w:t>Generate Batch Report:</w:t>
@@ -4813,7 +4768,6 @@
           <w:kern w:val="0"/>
           <w:sz w:val="24"/>
           <w:szCs w:val="24"/>
-          <w:bdr w:val="none" w:color="1F1F1F" w:sz="0" w:space="0"/>
           <w:lang w:val="en-US" w:eastAsia="zh-CN" w:bidi="ar"/>
         </w:rPr>
         <w:t xml:space="preserve"> Compiles the summary data for a completed run into exportable reports (PDF/CSV).</w:t>
@@ -4825,7 +4779,6 @@
           <w:kern w:val="0"/>
           <w:sz w:val="24"/>
           <w:szCs w:val="24"/>
-          <w:bdr w:val="none" w:color="auto" w:sz="0" w:space="0"/>
           <w:lang w:val="en-US" w:eastAsia="zh-CN" w:bidi="ar"/>
         </w:rPr>
         <w:t xml:space="preserve"> </w:t>
@@ -4837,6 +4790,7 @@
         <w:keepLines w:val="0"/>
         <w:widowControl/>
         <w:numPr>
+          <w:ilvl w:val="0"/>
           <w:numId w:val="0"/>
         </w:numPr>
         <w:suppressLineNumbers w:val="0"/>
@@ -4883,7 +4837,6 @@
           <w:b/>
           <w:bCs/>
           <w:color w:val="1F1F1F"/>
-          <w:bdr w:val="none" w:color="1F1F1F" w:sz="0" w:space="0"/>
         </w:rPr>
         <w:t>System Admin  Capabilitie</w:t>
       </w:r>
@@ -4893,7 +4846,6 @@
           <w:b/>
           <w:bCs/>
           <w:color w:val="1F1F1F"/>
-          <w:bdr w:val="none" w:color="1F1F1F" w:sz="0" w:space="0"/>
           <w:lang w:val="en-ZA"/>
         </w:rPr>
         <w:t>s</w:t>
@@ -4929,7 +4881,6 @@
           <w:kern w:val="0"/>
           <w:sz w:val="24"/>
           <w:szCs w:val="24"/>
-          <w:bdr w:val="none" w:color="1F1F1F" w:sz="0" w:space="0"/>
           <w:lang w:val="en-US" w:eastAsia="zh-CN" w:bidi="ar"/>
         </w:rPr>
         <w:t>Configure Grading Thresholds:</w:t>
@@ -4941,7 +4892,6 @@
           <w:kern w:val="0"/>
           <w:sz w:val="24"/>
           <w:szCs w:val="24"/>
-          <w:bdr w:val="none" w:color="1F1F1F" w:sz="0" w:space="0"/>
           <w:lang w:val="en-US" w:eastAsia="zh-CN" w:bidi="ar"/>
         </w:rPr>
         <w:t xml:space="preserve"> Adjusts physical and quality boundaries (e.g., minimum diameter, color ranges, defect percentage limits).</w:t>
@@ -4953,7 +4903,6 @@
           <w:kern w:val="0"/>
           <w:sz w:val="24"/>
           <w:szCs w:val="24"/>
-          <w:bdr w:val="none" w:color="auto" w:sz="0" w:space="0"/>
           <w:lang w:val="en-US" w:eastAsia="zh-CN" w:bidi="ar"/>
         </w:rPr>
         <w:t xml:space="preserve"> </w:t>
@@ -4965,6 +4914,7 @@
         <w:keepLines w:val="0"/>
         <w:widowControl/>
         <w:numPr>
+          <w:ilvl w:val="0"/>
           <w:numId w:val="0"/>
         </w:numPr>
         <w:suppressLineNumbers w:val="0"/>
@@ -5013,7 +4963,6 @@
           <w:kern w:val="0"/>
           <w:sz w:val="24"/>
           <w:szCs w:val="24"/>
-          <w:bdr w:val="none" w:color="1F1F1F" w:sz="0" w:space="0"/>
           <w:lang w:val="en-US" w:eastAsia="zh-CN" w:bidi="ar"/>
         </w:rPr>
         <w:t>Calibrate / Retrain Model:</w:t>
@@ -5025,7 +4974,6 @@
           <w:kern w:val="0"/>
           <w:sz w:val="24"/>
           <w:szCs w:val="24"/>
-          <w:bdr w:val="none" w:color="1F1F1F" w:sz="0" w:space="0"/>
           <w:lang w:val="en-US" w:eastAsia="zh-CN" w:bidi="ar"/>
         </w:rPr>
         <w:t xml:space="preserve"> Updates camera calibration profiles or loads updated AI weights into the system.</w:t>
@@ -5037,7 +4985,6 @@
           <w:kern w:val="0"/>
           <w:sz w:val="24"/>
           <w:szCs w:val="24"/>
-          <w:bdr w:val="none" w:color="auto" w:sz="0" w:space="0"/>
           <w:lang w:val="en-US" w:eastAsia="zh-CN" w:bidi="ar"/>
         </w:rPr>
         <w:t xml:space="preserve"> </w:t>
@@ -5064,7 +5011,6 @@
           <w:b/>
           <w:bCs/>
           <w:color w:val="1F1F1F"/>
-          <w:bdr w:val="none" w:color="1F1F1F" w:sz="0" w:space="0"/>
         </w:rPr>
       </w:pPr>
     </w:p>
@@ -5095,7 +5041,6 @@
           <w:b/>
           <w:bCs/>
           <w:color w:val="1F1F1F"/>
-          <w:bdr w:val="none" w:color="1F1F1F" w:sz="0" w:space="0"/>
         </w:rPr>
         <w:t>AI Subsystem Capabilities</w:t>
       </w:r>
@@ -5122,20 +5067,18 @@
           <w:kern w:val="0"/>
           <w:sz w:val="24"/>
           <w:szCs w:val="24"/>
-          <w:bdr w:val="none" w:color="auto" w:sz="0" w:space="0"/>
-          <w:lang w:val="en-US" w:eastAsia="zh-CN" w:bidi="ar"/>
-        </w:rPr>
-      </w:pPr>
-      <w:r>
-        <w:rPr>
-          <w:rFonts w:hint="default" w:ascii="Times New Roman" w:hAnsi="Times New Roman" w:eastAsia="sans-serif" w:cs="Times New Roman"/>
-          <w:b/>
-          <w:bCs/>
-          <w:color w:val="1F1F1F"/>
-          <w:kern w:val="0"/>
-          <w:sz w:val="24"/>
-          <w:szCs w:val="24"/>
-          <w:bdr w:val="none" w:color="1F1F1F" w:sz="0" w:space="0"/>
+          <w:lang w:val="en-US" w:eastAsia="zh-CN" w:bidi="ar"/>
+        </w:rPr>
+      </w:pPr>
+      <w:r>
+        <w:rPr>
+          <w:rFonts w:hint="default" w:ascii="Times New Roman" w:hAnsi="Times New Roman" w:eastAsia="sans-serif" w:cs="Times New Roman"/>
+          <w:b/>
+          <w:bCs/>
+          <w:color w:val="1F1F1F"/>
+          <w:kern w:val="0"/>
+          <w:sz w:val="24"/>
+          <w:szCs w:val="24"/>
           <w:lang w:val="en-US" w:eastAsia="zh-CN" w:bidi="ar"/>
         </w:rPr>
         <w:t>Detect &amp; Segment Fruit:</w:t>
@@ -5147,7 +5090,6 @@
           <w:kern w:val="0"/>
           <w:sz w:val="24"/>
           <w:szCs w:val="24"/>
-          <w:bdr w:val="none" w:color="1F1F1F" w:sz="0" w:space="0"/>
           <w:lang w:val="en-US" w:eastAsia="zh-CN" w:bidi="ar"/>
         </w:rPr>
         <w:t xml:space="preserve"> Isolates the fruit from the conveyor background in raw frames.</w:t>
@@ -5159,7 +5101,6 @@
           <w:kern w:val="0"/>
           <w:sz w:val="24"/>
           <w:szCs w:val="24"/>
-          <w:bdr w:val="none" w:color="auto" w:sz="0" w:space="0"/>
           <w:lang w:val="en-US" w:eastAsia="zh-CN" w:bidi="ar"/>
         </w:rPr>
         <w:t xml:space="preserve"> </w:t>
@@ -5195,7 +5136,6 @@
           <w:kern w:val="0"/>
           <w:sz w:val="24"/>
           <w:szCs w:val="24"/>
-          <w:bdr w:val="none" w:color="1F1F1F" w:sz="0" w:space="0"/>
           <w:lang w:val="en-US" w:eastAsia="zh-CN" w:bidi="ar"/>
         </w:rPr>
         <w:t>Analyze Features (Size / Color):</w:t>
@@ -5207,7 +5147,6 @@
           <w:kern w:val="0"/>
           <w:sz w:val="24"/>
           <w:szCs w:val="24"/>
-          <w:bdr w:val="none" w:color="1F1F1F" w:sz="0" w:space="0"/>
           <w:lang w:val="en-US" w:eastAsia="zh-CN" w:bidi="ar"/>
         </w:rPr>
         <w:t xml:space="preserve"> Extracts physical features such as pixel area, bounding dimensions, and color histograms.</w:t>
@@ -5219,7 +5158,6 @@
           <w:kern w:val="0"/>
           <w:sz w:val="24"/>
           <w:szCs w:val="24"/>
-          <w:bdr w:val="none" w:color="auto" w:sz="0" w:space="0"/>
           <w:lang w:val="en-US" w:eastAsia="zh-CN" w:bidi="ar"/>
         </w:rPr>
         <w:t xml:space="preserve"> </w:t>
@@ -5255,7 +5193,6 @@
           <w:kern w:val="0"/>
           <w:sz w:val="24"/>
           <w:szCs w:val="24"/>
-          <w:bdr w:val="none" w:color="1F1F1F" w:sz="0" w:space="0"/>
           <w:lang w:val="en-US" w:eastAsia="zh-CN" w:bidi="ar"/>
         </w:rPr>
         <w:t>Detect Surface Defects:</w:t>
@@ -5267,7 +5204,6 @@
           <w:kern w:val="0"/>
           <w:sz w:val="24"/>
           <w:szCs w:val="24"/>
-          <w:bdr w:val="none" w:color="1F1F1F" w:sz="0" w:space="0"/>
           <w:lang w:val="en-US" w:eastAsia="zh-CN" w:bidi="ar"/>
         </w:rPr>
         <w:t xml:space="preserve"> Scans the segmented fruit surface for blemishes, rot, or bruising.</w:t>
@@ -5279,7 +5215,6 @@
           <w:kern w:val="0"/>
           <w:sz w:val="24"/>
           <w:szCs w:val="24"/>
-          <w:bdr w:val="none" w:color="auto" w:sz="0" w:space="0"/>
           <w:lang w:val="en-US" w:eastAsia="zh-CN" w:bidi="ar"/>
         </w:rPr>
         <w:t xml:space="preserve"> </w:t>
@@ -5315,7 +5250,6 @@
           <w:kern w:val="0"/>
           <w:sz w:val="24"/>
           <w:szCs w:val="24"/>
-          <w:bdr w:val="none" w:color="1F1F1F" w:sz="0" w:space="0"/>
           <w:lang w:val="en-US" w:eastAsia="zh-CN" w:bidi="ar"/>
         </w:rPr>
         <w:t>Classify Grade:</w:t>
@@ -5327,7 +5261,6 @@
           <w:kern w:val="0"/>
           <w:sz w:val="24"/>
           <w:szCs w:val="24"/>
-          <w:bdr w:val="none" w:color="1F1F1F" w:sz="0" w:space="0"/>
           <w:lang w:val="en-US" w:eastAsia="zh-CN" w:bidi="ar"/>
         </w:rPr>
         <w:t xml:space="preserve"> Merges extracted features and defect metrics to determine final grade assignment.</w:t>
@@ -5339,7 +5272,6 @@
           <w:kern w:val="0"/>
           <w:sz w:val="24"/>
           <w:szCs w:val="24"/>
-          <w:bdr w:val="none" w:color="auto" w:sz="0" w:space="0"/>
           <w:lang w:val="en-US" w:eastAsia="zh-CN" w:bidi="ar"/>
         </w:rPr>
         <w:t xml:space="preserve"> </w:t>
@@ -5351,6 +5283,7 @@
         <w:keepLines w:val="0"/>
         <w:widowControl/>
         <w:numPr>
+          <w:ilvl w:val="0"/>
           <w:numId w:val="0"/>
         </w:numPr>
         <w:suppressLineNumbers w:val="0"/>
@@ -5394,7 +5327,6 @@
         <w:rPr>
           <w:rFonts w:hint="default" w:ascii="Times New Roman" w:hAnsi="Times New Roman" w:eastAsia="sans-serif" w:cs="Times New Roman"/>
           <w:color w:val="1F1F1F"/>
-          <w:bdr w:val="none" w:color="1F1F1F" w:sz="0" w:space="0"/>
         </w:rPr>
         <w:t>3. Key Relationships (</w:t>
       </w:r>
@@ -5409,7 +5341,6 @@
           <w:color w:val="1F1F1F"/>
           <w:sz w:val="18"/>
           <w:szCs w:val="18"/>
-          <w:bdr w:val="none" w:color="auto" w:sz="0" w:space="0"/>
         </w:rPr>
         <w:t>&lt;&lt;include&gt;&gt;</w:t>
       </w:r>
@@ -5417,7 +5348,6 @@
         <w:rPr>
           <w:rFonts w:hint="default" w:ascii="Times New Roman" w:hAnsi="Times New Roman" w:eastAsia="sans-serif" w:cs="Times New Roman"/>
           <w:color w:val="1F1F1F"/>
-          <w:bdr w:val="none" w:color="1F1F1F" w:sz="0" w:space="0"/>
         </w:rPr>
         <w:t xml:space="preserve"> / </w:t>
       </w:r>
@@ -5432,7 +5362,6 @@
           <w:color w:val="1F1F1F"/>
           <w:sz w:val="18"/>
           <w:szCs w:val="18"/>
-          <w:bdr w:val="none" w:color="auto" w:sz="0" w:space="0"/>
         </w:rPr>
         <w:t>&lt;&lt;extend&gt;&gt;</w:t>
       </w:r>
@@ -5440,7 +5369,6 @@
         <w:rPr>
           <w:rFonts w:hint="default" w:ascii="Times New Roman" w:hAnsi="Times New Roman" w:eastAsia="sans-serif" w:cs="Times New Roman"/>
           <w:color w:val="1F1F1F"/>
-          <w:bdr w:val="none" w:color="1F1F1F" w:sz="0" w:space="0"/>
         </w:rPr>
         <w:t>)</w:t>
       </w:r>
@@ -5475,7 +5403,6 @@
           <w:kern w:val="0"/>
           <w:sz w:val="24"/>
           <w:szCs w:val="24"/>
-          <w:bdr w:val="none" w:color="1F1F1F" w:sz="0" w:space="0"/>
           <w:lang w:val="en-US" w:eastAsia="zh-CN" w:bidi="ar"/>
         </w:rPr>
         <w:t>Capture Fruit Image</w:t>
@@ -5489,7 +5416,6 @@
           <w:kern w:val="0"/>
           <w:sz w:val="24"/>
           <w:szCs w:val="24"/>
-          <w:bdr w:val="none" w:color="1F1F1F" w:sz="0" w:space="0"/>
           <w:lang w:val="en-ZA" w:eastAsia="zh-CN" w:bidi="ar"/>
         </w:rPr>
         <w:t xml:space="preserve"> -&gt;</w:t>
@@ -5503,7 +5429,6 @@
           <w:kern w:val="0"/>
           <w:sz w:val="24"/>
           <w:szCs w:val="24"/>
-          <w:bdr w:val="none" w:color="1F1F1F" w:sz="0" w:space="0"/>
           <w:lang w:val="en-US" w:eastAsia="zh-CN" w:bidi="ar"/>
         </w:rPr>
         <w:t xml:space="preserve"> Detect &amp; Segment Fruit:</w:t>
@@ -5515,7 +5440,6 @@
           <w:kern w:val="0"/>
           <w:sz w:val="24"/>
           <w:szCs w:val="24"/>
-          <w:bdr w:val="none" w:color="1F1F1F" w:sz="0" w:space="0"/>
           <w:lang w:val="en-US" w:eastAsia="zh-CN" w:bidi="ar"/>
         </w:rPr>
         <w:t xml:space="preserve"> Capturing an image automatically invokes the vision subsystem to segment the fruit from the background.</w:t>
@@ -5527,7 +5451,6 @@
           <w:kern w:val="0"/>
           <w:sz w:val="24"/>
           <w:szCs w:val="24"/>
-          <w:bdr w:val="none" w:color="auto" w:sz="0" w:space="0"/>
           <w:lang w:val="en-US" w:eastAsia="zh-CN" w:bidi="ar"/>
         </w:rPr>
         <w:t xml:space="preserve"> </w:t>
@@ -5563,7 +5486,6 @@
           <w:kern w:val="0"/>
           <w:sz w:val="24"/>
           <w:szCs w:val="24"/>
-          <w:bdr w:val="none" w:color="1F1F1F" w:sz="0" w:space="0"/>
           <w:lang w:val="en-US" w:eastAsia="zh-CN" w:bidi="ar"/>
         </w:rPr>
         <w:t>Classify Grad</w:t>
@@ -5577,7 +5499,6 @@
           <w:kern w:val="0"/>
           <w:sz w:val="24"/>
           <w:szCs w:val="24"/>
-          <w:bdr w:val="none" w:color="1F1F1F" w:sz="0" w:space="0"/>
           <w:lang w:val="en-ZA" w:eastAsia="zh-CN" w:bidi="ar"/>
         </w:rPr>
         <w:t>e -&gt;</w:t>
@@ -5591,7 +5512,6 @@
           <w:kern w:val="0"/>
           <w:sz w:val="24"/>
           <w:szCs w:val="24"/>
-          <w:bdr w:val="none" w:color="1F1F1F" w:sz="0" w:space="0"/>
           <w:lang w:val="en-US" w:eastAsia="zh-CN" w:bidi="ar"/>
         </w:rPr>
         <w:t xml:space="preserve"> Analyze Features &amp; Detect Surface Defects:</w:t>
@@ -5603,7 +5523,6 @@
           <w:kern w:val="0"/>
           <w:sz w:val="24"/>
           <w:szCs w:val="24"/>
-          <w:bdr w:val="none" w:color="1F1F1F" w:sz="0" w:space="0"/>
           <w:lang w:val="en-US" w:eastAsia="zh-CN" w:bidi="ar"/>
         </w:rPr>
         <w:t xml:space="preserve"> Final grade classification depends directly on executing feature extraction and surface defect detection.</w:t>
@@ -5615,7 +5534,6 @@
           <w:kern w:val="0"/>
           <w:sz w:val="24"/>
           <w:szCs w:val="24"/>
-          <w:bdr w:val="none" w:color="auto" w:sz="0" w:space="0"/>
           <w:lang w:val="en-US" w:eastAsia="zh-CN" w:bidi="ar"/>
         </w:rPr>
         <w:t xml:space="preserve"> </w:t>
@@ -5651,7 +5569,6 @@
           <w:kern w:val="0"/>
           <w:sz w:val="24"/>
           <w:szCs w:val="24"/>
-          <w:bdr w:val="none" w:color="1F1F1F" w:sz="0" w:space="0"/>
           <w:lang w:val="en-US" w:eastAsia="zh-CN" w:bidi="ar"/>
         </w:rPr>
         <w:t>Override Grade</w:t>
@@ -5665,7 +5582,6 @@
           <w:kern w:val="0"/>
           <w:sz w:val="24"/>
           <w:szCs w:val="24"/>
-          <w:bdr w:val="none" w:color="1F1F1F" w:sz="0" w:space="0"/>
           <w:lang w:val="en-ZA" w:eastAsia="zh-CN" w:bidi="ar"/>
         </w:rPr>
         <w:t xml:space="preserve"> -&gt; </w:t>
@@ -5679,7 +5595,6 @@
           <w:kern w:val="0"/>
           <w:sz w:val="24"/>
           <w:szCs w:val="24"/>
-          <w:bdr w:val="none" w:color="1F1F1F" w:sz="0" w:space="0"/>
           <w:lang w:val="en-US" w:eastAsia="zh-CN" w:bidi="ar"/>
         </w:rPr>
         <w:t>View Real-Time Results:</w:t>
@@ -5691,7 +5606,6 @@
           <w:kern w:val="0"/>
           <w:sz w:val="24"/>
           <w:szCs w:val="24"/>
-          <w:bdr w:val="none" w:color="1F1F1F" w:sz="0" w:space="0"/>
           <w:lang w:val="en-US" w:eastAsia="zh-CN" w:bidi="ar"/>
         </w:rPr>
         <w:t xml:space="preserve"> Overriding a grade is an optional extension triggered by the operator while inspecting live results.</w:t>
@@ -5703,7 +5617,6 @@
           <w:kern w:val="0"/>
           <w:sz w:val="24"/>
           <w:szCs w:val="24"/>
-          <w:bdr w:val="none" w:color="auto" w:sz="0" w:space="0"/>
           <w:lang w:val="en-US" w:eastAsia="zh-CN" w:bidi="ar"/>
         </w:rPr>
         <w:t xml:space="preserve"> </w:t>
@@ -5715,6 +5628,7 @@
         <w:keepLines w:val="0"/>
         <w:widowControl/>
         <w:numPr>
+          <w:ilvl w:val="0"/>
           <w:numId w:val="0"/>
         </w:numPr>
         <w:suppressLineNumbers w:val="0"/>
@@ -5735,7 +5649,7 @@
     </w:p>
     <w:p>
       <w:pPr>
-        <w:pStyle w:val="10"/>
+        <w:pStyle w:val="11"/>
         <w:keepNext w:val="0"/>
         <w:keepLines w:val="0"/>
         <w:widowControl/>
@@ -5750,7 +5664,7 @@
     </w:p>
     <w:p>
       <w:pPr>
-        <w:pStyle w:val="10"/>
+        <w:pStyle w:val="11"/>
         <w:keepNext w:val="0"/>
         <w:keepLines w:val="0"/>
         <w:widowControl/>
@@ -5775,7 +5689,7 @@
     </w:p>
     <w:p>
       <w:pPr>
-        <w:pStyle w:val="10"/>
+        <w:pStyle w:val="11"/>
         <w:keepNext w:val="0"/>
         <w:keepLines w:val="0"/>
         <w:widowControl/>
@@ -5800,7 +5714,7 @@
     </w:p>
     <w:p>
       <w:pPr>
-        <w:pStyle w:val="10"/>
+        <w:pStyle w:val="11"/>
         <w:keepNext w:val="0"/>
         <w:keepLines w:val="0"/>
         <w:widowControl/>
@@ -5825,7 +5739,7 @@
     </w:p>
     <w:p>
       <w:pPr>
-        <w:pStyle w:val="10"/>
+        <w:pStyle w:val="11"/>
         <w:keepNext w:val="0"/>
         <w:keepLines w:val="0"/>
         <w:widowControl/>
@@ -5850,7 +5764,7 @@
     </w:p>
     <w:p>
       <w:pPr>
-        <w:pStyle w:val="10"/>
+        <w:pStyle w:val="11"/>
         <w:keepNext w:val="0"/>
         <w:keepLines w:val="0"/>
         <w:widowControl/>
@@ -5875,7 +5789,7 @@
     </w:p>
     <w:p>
       <w:pPr>
-        <w:pStyle w:val="10"/>
+        <w:pStyle w:val="11"/>
         <w:keepNext w:val="0"/>
         <w:keepLines w:val="0"/>
         <w:widowControl/>
@@ -5900,7 +5814,7 @@
     </w:p>
     <w:p>
       <w:pPr>
-        <w:pStyle w:val="10"/>
+        <w:pStyle w:val="11"/>
         <w:keepNext w:val="0"/>
         <w:keepLines w:val="0"/>
         <w:widowControl/>
@@ -5925,7 +5839,7 @@
     </w:p>
     <w:p>
       <w:pPr>
-        <w:pStyle w:val="10"/>
+        <w:pStyle w:val="11"/>
         <w:keepNext w:val="0"/>
         <w:keepLines w:val="0"/>
         <w:widowControl/>
@@ -5950,7 +5864,7 @@
     </w:p>
     <w:p>
       <w:pPr>
-        <w:pStyle w:val="10"/>
+        <w:pStyle w:val="11"/>
         <w:keepNext w:val="0"/>
         <w:keepLines w:val="0"/>
         <w:widowControl/>
@@ -5975,7 +5889,7 @@
     </w:p>
     <w:p>
       <w:pPr>
-        <w:pStyle w:val="10"/>
+        <w:pStyle w:val="11"/>
         <w:keepNext w:val="0"/>
         <w:keepLines w:val="0"/>
         <w:widowControl/>
@@ -6000,7 +5914,7 @@
     </w:p>
     <w:p>
       <w:pPr>
-        <w:pStyle w:val="10"/>
+        <w:pStyle w:val="11"/>
         <w:keepNext w:val="0"/>
         <w:keepLines w:val="0"/>
         <w:widowControl/>
@@ -6025,7 +5939,1181 @@
     </w:p>
     <w:p>
       <w:pPr>
+        <w:pStyle w:val="11"/>
+        <w:keepNext w:val="0"/>
+        <w:keepLines w:val="0"/>
+        <w:widowControl/>
+        <w:suppressLineNumbers w:val="0"/>
+        <w:spacing w:line="240" w:lineRule="auto"/>
+        <w:rPr>
+          <w:rFonts w:hint="default" w:cs="Times New Roman"/>
+          <w:b/>
+          <w:bCs/>
+          <w:lang w:val="en-ZA"/>
+        </w:rPr>
+      </w:pPr>
+      <w:r>
+        <w:rPr>
+          <w:rFonts w:hint="default" w:cs="Times New Roman"/>
+          <w:b/>
+          <w:bCs/>
+          <w:lang w:val="en-ZA"/>
+        </w:rPr>
+        <w:t xml:space="preserve"> Implementations </w:t>
+      </w:r>
+    </w:p>
+    <w:tbl>
+      <w:tblPr>
+        <w:tblStyle w:val="13"/>
+        <w:tblW w:w="0" w:type="auto"/>
+        <w:jc w:val="center"/>
+        <w:tblBorders>
+          <w:top w:val="single" w:color="auto" w:sz="4" w:space="0"/>
+          <w:left w:val="single" w:color="auto" w:sz="4" w:space="0"/>
+          <w:bottom w:val="single" w:color="auto" w:sz="4" w:space="0"/>
+          <w:right w:val="single" w:color="auto" w:sz="4" w:space="0"/>
+          <w:insideH w:val="single" w:color="auto" w:sz="4" w:space="0"/>
+          <w:insideV w:val="single" w:color="auto" w:sz="4" w:space="0"/>
+        </w:tblBorders>
+        <w:tblLayout w:type="autofit"/>
+        <w:tblCellMar>
+          <w:top w:w="0" w:type="dxa"/>
+          <w:left w:w="108" w:type="dxa"/>
+          <w:bottom w:w="0" w:type="dxa"/>
+          <w:right w:w="108" w:type="dxa"/>
+        </w:tblCellMar>
+      </w:tblPr>
+      <w:tblGrid>
+        <w:gridCol w:w="4013"/>
+        <w:gridCol w:w="4509"/>
+      </w:tblGrid>
+      <w:tr>
+        <w:tblPrEx>
+          <w:tblBorders>
+            <w:top w:val="single" w:color="auto" w:sz="4" w:space="0"/>
+            <w:left w:val="single" w:color="auto" w:sz="4" w:space="0"/>
+            <w:bottom w:val="single" w:color="auto" w:sz="4" w:space="0"/>
+            <w:right w:val="single" w:color="auto" w:sz="4" w:space="0"/>
+            <w:insideH w:val="single" w:color="auto" w:sz="4" w:space="0"/>
+            <w:insideV w:val="single" w:color="auto" w:sz="4" w:space="0"/>
+          </w:tblBorders>
+          <w:tblCellMar>
+            <w:top w:w="0" w:type="dxa"/>
+            <w:left w:w="108" w:type="dxa"/>
+            <w:bottom w:w="0" w:type="dxa"/>
+            <w:right w:w="108" w:type="dxa"/>
+          </w:tblCellMar>
+        </w:tblPrEx>
+        <w:trPr>
+          <w:jc w:val="center"/>
+        </w:trPr>
+        <w:tc>
+          <w:tcPr>
+            <w:tcW w:w="4968" w:type="dxa"/>
+            <w:tcBorders>
+              <w:top w:val="dotted" w:color="auto" w:sz="4" w:space="0"/>
+              <w:left w:val="dotted" w:color="auto" w:sz="4" w:space="0"/>
+              <w:bottom w:val="dotted" w:color="auto" w:sz="4" w:space="0"/>
+              <w:right w:val="dotted" w:color="auto" w:sz="4" w:space="0"/>
+            </w:tcBorders>
+            <w:shd w:val="clear" w:color="auto" w:fill="FFFFFF"/>
+            <w:vAlign w:val="center"/>
+          </w:tcPr>
+          <w:p>
+            <w:pPr>
+              <w:spacing w:after="0" w:line="240" w:lineRule="auto"/>
+              <w:rPr>
+                <w:rFonts w:hint="default" w:ascii="Times New Roman" w:hAnsi="Times New Roman" w:cs="Times New Roman"/>
+                <w:color w:val="000000"/>
+              </w:rPr>
+            </w:pPr>
+            <w:r>
+              <w:rPr>
+                <w:rFonts w:hint="default" w:ascii="Times New Roman" w:hAnsi="Times New Roman" w:cs="Times New Roman"/>
+                <w:b/>
+                <w:color w:val="000000"/>
+              </w:rPr>
+              <w:t>Component</w:t>
+            </w:r>
+          </w:p>
+        </w:tc>
+        <w:tc>
+          <w:tcPr>
+            <w:tcW w:w="4968" w:type="dxa"/>
+            <w:tcBorders>
+              <w:top w:val="dotted" w:color="auto" w:sz="4" w:space="0"/>
+              <w:left w:val="dotted" w:color="auto" w:sz="4" w:space="0"/>
+              <w:bottom w:val="dotted" w:color="auto" w:sz="4" w:space="0"/>
+              <w:right w:val="dotted" w:color="auto" w:sz="4" w:space="0"/>
+            </w:tcBorders>
+            <w:shd w:val="clear" w:color="auto" w:fill="FFFFFF"/>
+            <w:vAlign w:val="center"/>
+          </w:tcPr>
+          <w:p>
+            <w:pPr>
+              <w:spacing w:after="0" w:line="240" w:lineRule="auto"/>
+              <w:rPr>
+                <w:rFonts w:hint="default" w:ascii="Times New Roman" w:hAnsi="Times New Roman" w:cs="Times New Roman"/>
+                <w:color w:val="000000"/>
+              </w:rPr>
+            </w:pPr>
+            <w:r>
+              <w:rPr>
+                <w:rFonts w:hint="default" w:ascii="Times New Roman" w:hAnsi="Times New Roman" w:cs="Times New Roman"/>
+                <w:b/>
+                <w:color w:val="000000"/>
+              </w:rPr>
+              <w:t>Current implementation</w:t>
+            </w:r>
+          </w:p>
+        </w:tc>
+      </w:tr>
+      <w:tr>
+        <w:tblPrEx>
+          <w:tblBorders>
+            <w:top w:val="single" w:color="auto" w:sz="4" w:space="0"/>
+            <w:left w:val="single" w:color="auto" w:sz="4" w:space="0"/>
+            <w:bottom w:val="single" w:color="auto" w:sz="4" w:space="0"/>
+            <w:right w:val="single" w:color="auto" w:sz="4" w:space="0"/>
+            <w:insideH w:val="single" w:color="auto" w:sz="4" w:space="0"/>
+            <w:insideV w:val="single" w:color="auto" w:sz="4" w:space="0"/>
+          </w:tblBorders>
+          <w:tblCellMar>
+            <w:top w:w="0" w:type="dxa"/>
+            <w:left w:w="108" w:type="dxa"/>
+            <w:bottom w:w="0" w:type="dxa"/>
+            <w:right w:w="108" w:type="dxa"/>
+          </w:tblCellMar>
+        </w:tblPrEx>
+        <w:trPr>
+          <w:jc w:val="center"/>
+        </w:trPr>
+        <w:tc>
+          <w:tcPr>
+            <w:tcW w:w="4968" w:type="dxa"/>
+            <w:tcBorders>
+              <w:top w:val="dotted" w:color="auto" w:sz="4" w:space="0"/>
+              <w:left w:val="dotted" w:color="auto" w:sz="4" w:space="0"/>
+              <w:bottom w:val="dotted" w:color="auto" w:sz="4" w:space="0"/>
+              <w:right w:val="dotted" w:color="auto" w:sz="4" w:space="0"/>
+            </w:tcBorders>
+            <w:shd w:val="clear" w:color="auto" w:fill="FFFFFF"/>
+            <w:vAlign w:val="center"/>
+          </w:tcPr>
+          <w:p>
+            <w:pPr>
+              <w:spacing w:after="0" w:line="240" w:lineRule="auto"/>
+              <w:rPr>
+                <w:rFonts w:hint="default" w:ascii="Times New Roman" w:hAnsi="Times New Roman" w:cs="Times New Roman"/>
+                <w:color w:val="000000"/>
+              </w:rPr>
+            </w:pPr>
+            <w:r>
+              <w:rPr>
+                <w:rFonts w:hint="default" w:ascii="Times New Roman" w:hAnsi="Times New Roman" w:cs="Times New Roman"/>
+                <w:color w:val="000000"/>
+              </w:rPr>
+              <w:t>Web service</w:t>
+            </w:r>
+          </w:p>
+        </w:tc>
+        <w:tc>
+          <w:tcPr>
+            <w:tcW w:w="4968" w:type="dxa"/>
+            <w:tcBorders>
+              <w:top w:val="dotted" w:color="auto" w:sz="4" w:space="0"/>
+              <w:left w:val="dotted" w:color="auto" w:sz="4" w:space="0"/>
+              <w:bottom w:val="dotted" w:color="auto" w:sz="4" w:space="0"/>
+              <w:right w:val="dotted" w:color="auto" w:sz="4" w:space="0"/>
+            </w:tcBorders>
+            <w:shd w:val="clear" w:color="auto" w:fill="FFFFFF"/>
+            <w:vAlign w:val="center"/>
+          </w:tcPr>
+          <w:p>
+            <w:pPr>
+              <w:spacing w:after="0" w:line="240" w:lineRule="auto"/>
+              <w:rPr>
+                <w:rFonts w:hint="default" w:ascii="Times New Roman" w:hAnsi="Times New Roman" w:cs="Times New Roman"/>
+                <w:color w:val="000000"/>
+              </w:rPr>
+            </w:pPr>
+            <w:r>
+              <w:rPr>
+                <w:rFonts w:hint="default" w:ascii="Times New Roman" w:hAnsi="Times New Roman" w:cs="Times New Roman"/>
+                <w:color w:val="000000"/>
+              </w:rPr>
+              <w:t>FastAPI application with health, readiness, status, event, report, camera, and sorter control endpoints.</w:t>
+            </w:r>
+          </w:p>
+        </w:tc>
+      </w:tr>
+      <w:tr>
+        <w:tblPrEx>
+          <w:tblBorders>
+            <w:top w:val="single" w:color="auto" w:sz="4" w:space="0"/>
+            <w:left w:val="single" w:color="auto" w:sz="4" w:space="0"/>
+            <w:bottom w:val="single" w:color="auto" w:sz="4" w:space="0"/>
+            <w:right w:val="single" w:color="auto" w:sz="4" w:space="0"/>
+            <w:insideH w:val="single" w:color="auto" w:sz="4" w:space="0"/>
+            <w:insideV w:val="single" w:color="auto" w:sz="4" w:space="0"/>
+          </w:tblBorders>
+          <w:tblCellMar>
+            <w:top w:w="0" w:type="dxa"/>
+            <w:left w:w="108" w:type="dxa"/>
+            <w:bottom w:w="0" w:type="dxa"/>
+            <w:right w:w="108" w:type="dxa"/>
+          </w:tblCellMar>
+        </w:tblPrEx>
+        <w:trPr>
+          <w:jc w:val="center"/>
+        </w:trPr>
+        <w:tc>
+          <w:tcPr>
+            <w:tcW w:w="4968" w:type="dxa"/>
+            <w:tcBorders>
+              <w:top w:val="dotted" w:color="auto" w:sz="4" w:space="0"/>
+              <w:left w:val="dotted" w:color="auto" w:sz="4" w:space="0"/>
+              <w:bottom w:val="dotted" w:color="auto" w:sz="4" w:space="0"/>
+              <w:right w:val="dotted" w:color="auto" w:sz="4" w:space="0"/>
+            </w:tcBorders>
+            <w:shd w:val="clear" w:color="auto" w:fill="FFFFFF"/>
+            <w:vAlign w:val="center"/>
+          </w:tcPr>
+          <w:p>
+            <w:pPr>
+              <w:spacing w:after="0" w:line="240" w:lineRule="auto"/>
+              <w:rPr>
+                <w:rFonts w:hint="default" w:ascii="Times New Roman" w:hAnsi="Times New Roman" w:cs="Times New Roman"/>
+                <w:color w:val="000000"/>
+              </w:rPr>
+            </w:pPr>
+            <w:r>
+              <w:rPr>
+                <w:rFonts w:hint="default" w:ascii="Times New Roman" w:hAnsi="Times New Roman" w:cs="Times New Roman"/>
+                <w:color w:val="000000"/>
+              </w:rPr>
+              <w:t>Inference</w:t>
+            </w:r>
+          </w:p>
+        </w:tc>
+        <w:tc>
+          <w:tcPr>
+            <w:tcW w:w="4968" w:type="dxa"/>
+            <w:tcBorders>
+              <w:top w:val="dotted" w:color="auto" w:sz="4" w:space="0"/>
+              <w:left w:val="dotted" w:color="auto" w:sz="4" w:space="0"/>
+              <w:bottom w:val="dotted" w:color="auto" w:sz="4" w:space="0"/>
+              <w:right w:val="dotted" w:color="auto" w:sz="4" w:space="0"/>
+            </w:tcBorders>
+            <w:shd w:val="clear" w:color="auto" w:fill="FFFFFF"/>
+            <w:vAlign w:val="center"/>
+          </w:tcPr>
+          <w:p>
+            <w:pPr>
+              <w:spacing w:after="0" w:line="240" w:lineRule="auto"/>
+              <w:rPr>
+                <w:rFonts w:hint="default" w:ascii="Times New Roman" w:hAnsi="Times New Roman" w:cs="Times New Roman"/>
+                <w:color w:val="000000"/>
+              </w:rPr>
+            </w:pPr>
+            <w:r>
+              <w:rPr>
+                <w:rFonts w:hint="default" w:ascii="Times New Roman" w:hAnsi="Times New Roman" w:cs="Times New Roman"/>
+                <w:color w:val="000000"/>
+              </w:rPr>
+              <w:t>FruitClassifier loads FruitClassifier.keras and FruitClassifier.json; inference runs in a background thread.</w:t>
+            </w:r>
+          </w:p>
+        </w:tc>
+      </w:tr>
+      <w:tr>
+        <w:tblPrEx>
+          <w:tblBorders>
+            <w:top w:val="single" w:color="auto" w:sz="4" w:space="0"/>
+            <w:left w:val="single" w:color="auto" w:sz="4" w:space="0"/>
+            <w:bottom w:val="single" w:color="auto" w:sz="4" w:space="0"/>
+            <w:right w:val="single" w:color="auto" w:sz="4" w:space="0"/>
+            <w:insideH w:val="single" w:color="auto" w:sz="4" w:space="0"/>
+            <w:insideV w:val="single" w:color="auto" w:sz="4" w:space="0"/>
+          </w:tblBorders>
+          <w:tblCellMar>
+            <w:top w:w="0" w:type="dxa"/>
+            <w:left w:w="108" w:type="dxa"/>
+            <w:bottom w:w="0" w:type="dxa"/>
+            <w:right w:w="108" w:type="dxa"/>
+          </w:tblCellMar>
+        </w:tblPrEx>
+        <w:trPr>
+          <w:jc w:val="center"/>
+        </w:trPr>
+        <w:tc>
+          <w:tcPr>
+            <w:tcW w:w="4968" w:type="dxa"/>
+            <w:tcBorders>
+              <w:top w:val="dotted" w:color="auto" w:sz="4" w:space="0"/>
+              <w:left w:val="dotted" w:color="auto" w:sz="4" w:space="0"/>
+              <w:bottom w:val="dotted" w:color="auto" w:sz="4" w:space="0"/>
+              <w:right w:val="dotted" w:color="auto" w:sz="4" w:space="0"/>
+            </w:tcBorders>
+            <w:shd w:val="clear" w:color="auto" w:fill="FFFFFF"/>
+            <w:vAlign w:val="center"/>
+          </w:tcPr>
+          <w:p>
+            <w:pPr>
+              <w:spacing w:after="0" w:line="240" w:lineRule="auto"/>
+              <w:rPr>
+                <w:rFonts w:hint="default" w:ascii="Times New Roman" w:hAnsi="Times New Roman" w:cs="Times New Roman"/>
+                <w:color w:val="000000"/>
+              </w:rPr>
+            </w:pPr>
+            <w:r>
+              <w:rPr>
+                <w:rFonts w:hint="default" w:ascii="Times New Roman" w:hAnsi="Times New Roman" w:cs="Times New Roman"/>
+                <w:color w:val="000000"/>
+              </w:rPr>
+              <w:t>Camera</w:t>
+            </w:r>
+          </w:p>
+        </w:tc>
+        <w:tc>
+          <w:tcPr>
+            <w:tcW w:w="4968" w:type="dxa"/>
+            <w:tcBorders>
+              <w:top w:val="dotted" w:color="auto" w:sz="4" w:space="0"/>
+              <w:left w:val="dotted" w:color="auto" w:sz="4" w:space="0"/>
+              <w:bottom w:val="dotted" w:color="auto" w:sz="4" w:space="0"/>
+              <w:right w:val="dotted" w:color="auto" w:sz="4" w:space="0"/>
+            </w:tcBorders>
+            <w:shd w:val="clear" w:color="auto" w:fill="FFFFFF"/>
+            <w:vAlign w:val="center"/>
+          </w:tcPr>
+          <w:p>
+            <w:pPr>
+              <w:spacing w:after="0" w:line="240" w:lineRule="auto"/>
+              <w:rPr>
+                <w:rFonts w:hint="default" w:ascii="Times New Roman" w:hAnsi="Times New Roman" w:cs="Times New Roman"/>
+                <w:color w:val="000000"/>
+              </w:rPr>
+            </w:pPr>
+            <w:r>
+              <w:rPr>
+                <w:rFonts w:hint="default" w:ascii="Times New Roman" w:hAnsi="Times New Roman" w:cs="Times New Roman"/>
+                <w:color w:val="000000"/>
+              </w:rPr>
+              <w:t>OpenCV reads the configured network stream from FRUIT_SORTER_CAMERA_URL.</w:t>
+            </w:r>
+          </w:p>
+        </w:tc>
+      </w:tr>
+      <w:tr>
+        <w:tblPrEx>
+          <w:tblBorders>
+            <w:top w:val="single" w:color="auto" w:sz="4" w:space="0"/>
+            <w:left w:val="single" w:color="auto" w:sz="4" w:space="0"/>
+            <w:bottom w:val="single" w:color="auto" w:sz="4" w:space="0"/>
+            <w:right w:val="single" w:color="auto" w:sz="4" w:space="0"/>
+            <w:insideH w:val="single" w:color="auto" w:sz="4" w:space="0"/>
+            <w:insideV w:val="single" w:color="auto" w:sz="4" w:space="0"/>
+          </w:tblBorders>
+          <w:tblCellMar>
+            <w:top w:w="0" w:type="dxa"/>
+            <w:left w:w="108" w:type="dxa"/>
+            <w:bottom w:w="0" w:type="dxa"/>
+            <w:right w:w="108" w:type="dxa"/>
+          </w:tblCellMar>
+        </w:tblPrEx>
+        <w:trPr>
+          <w:jc w:val="center"/>
+        </w:trPr>
+        <w:tc>
+          <w:tcPr>
+            <w:tcW w:w="4968" w:type="dxa"/>
+            <w:tcBorders>
+              <w:top w:val="dotted" w:color="auto" w:sz="4" w:space="0"/>
+              <w:left w:val="dotted" w:color="auto" w:sz="4" w:space="0"/>
+              <w:bottom w:val="dotted" w:color="auto" w:sz="4" w:space="0"/>
+              <w:right w:val="dotted" w:color="auto" w:sz="4" w:space="0"/>
+            </w:tcBorders>
+            <w:shd w:val="clear" w:color="auto" w:fill="FFFFFF"/>
+            <w:vAlign w:val="center"/>
+          </w:tcPr>
+          <w:p>
+            <w:pPr>
+              <w:spacing w:after="0" w:line="240" w:lineRule="auto"/>
+              <w:rPr>
+                <w:rFonts w:hint="default" w:ascii="Times New Roman" w:hAnsi="Times New Roman" w:cs="Times New Roman"/>
+                <w:color w:val="000000"/>
+              </w:rPr>
+            </w:pPr>
+            <w:r>
+              <w:rPr>
+                <w:rFonts w:hint="default" w:ascii="Times New Roman" w:hAnsi="Times New Roman" w:cs="Times New Roman"/>
+                <w:color w:val="000000"/>
+              </w:rPr>
+              <w:t>Storage</w:t>
+            </w:r>
+          </w:p>
+        </w:tc>
+        <w:tc>
+          <w:tcPr>
+            <w:tcW w:w="4968" w:type="dxa"/>
+            <w:tcBorders>
+              <w:top w:val="dotted" w:color="auto" w:sz="4" w:space="0"/>
+              <w:left w:val="dotted" w:color="auto" w:sz="4" w:space="0"/>
+              <w:bottom w:val="dotted" w:color="auto" w:sz="4" w:space="0"/>
+              <w:right w:val="dotted" w:color="auto" w:sz="4" w:space="0"/>
+            </w:tcBorders>
+            <w:shd w:val="clear" w:color="auto" w:fill="FFFFFF"/>
+            <w:vAlign w:val="center"/>
+          </w:tcPr>
+          <w:p>
+            <w:pPr>
+              <w:spacing w:after="0" w:line="240" w:lineRule="auto"/>
+              <w:rPr>
+                <w:rFonts w:hint="default" w:ascii="Times New Roman" w:hAnsi="Times New Roman" w:cs="Times New Roman"/>
+                <w:color w:val="000000"/>
+              </w:rPr>
+            </w:pPr>
+            <w:r>
+              <w:rPr>
+                <w:rFonts w:hint="default" w:ascii="Times New Roman" w:hAnsi="Times New Roman" w:cs="Times New Roman"/>
+                <w:color w:val="000000"/>
+              </w:rPr>
+              <w:t>SQLite records event labels, fruit, quality, source, timestamp, and optional saved frame path.</w:t>
+            </w:r>
+          </w:p>
+        </w:tc>
+      </w:tr>
+      <w:tr>
+        <w:tblPrEx>
+          <w:tblBorders>
+            <w:top w:val="single" w:color="auto" w:sz="4" w:space="0"/>
+            <w:left w:val="single" w:color="auto" w:sz="4" w:space="0"/>
+            <w:bottom w:val="single" w:color="auto" w:sz="4" w:space="0"/>
+            <w:right w:val="single" w:color="auto" w:sz="4" w:space="0"/>
+            <w:insideH w:val="single" w:color="auto" w:sz="4" w:space="0"/>
+            <w:insideV w:val="single" w:color="auto" w:sz="4" w:space="0"/>
+          </w:tblBorders>
+          <w:tblCellMar>
+            <w:top w:w="0" w:type="dxa"/>
+            <w:left w:w="108" w:type="dxa"/>
+            <w:bottom w:w="0" w:type="dxa"/>
+            <w:right w:w="108" w:type="dxa"/>
+          </w:tblCellMar>
+        </w:tblPrEx>
+        <w:trPr>
+          <w:jc w:val="center"/>
+        </w:trPr>
+        <w:tc>
+          <w:tcPr>
+            <w:tcW w:w="4968" w:type="dxa"/>
+            <w:tcBorders>
+              <w:top w:val="dotted" w:color="auto" w:sz="4" w:space="0"/>
+              <w:left w:val="dotted" w:color="auto" w:sz="4" w:space="0"/>
+              <w:bottom w:val="dotted" w:color="auto" w:sz="4" w:space="0"/>
+              <w:right w:val="dotted" w:color="auto" w:sz="4" w:space="0"/>
+            </w:tcBorders>
+            <w:shd w:val="clear" w:color="auto" w:fill="FFFFFF"/>
+            <w:vAlign w:val="center"/>
+          </w:tcPr>
+          <w:p>
+            <w:pPr>
+              <w:spacing w:after="0" w:line="240" w:lineRule="auto"/>
+              <w:rPr>
+                <w:rFonts w:hint="default" w:ascii="Times New Roman" w:hAnsi="Times New Roman" w:cs="Times New Roman"/>
+                <w:color w:val="000000"/>
+              </w:rPr>
+            </w:pPr>
+            <w:r>
+              <w:rPr>
+                <w:rFonts w:hint="default" w:ascii="Times New Roman" w:hAnsi="Times New Roman" w:cs="Times New Roman"/>
+                <w:color w:val="000000"/>
+              </w:rPr>
+              <w:t>Dashboard</w:t>
+            </w:r>
+          </w:p>
+        </w:tc>
+        <w:tc>
+          <w:tcPr>
+            <w:tcW w:w="4968" w:type="dxa"/>
+            <w:tcBorders>
+              <w:top w:val="dotted" w:color="auto" w:sz="4" w:space="0"/>
+              <w:left w:val="dotted" w:color="auto" w:sz="4" w:space="0"/>
+              <w:bottom w:val="dotted" w:color="auto" w:sz="4" w:space="0"/>
+              <w:right w:val="dotted" w:color="auto" w:sz="4" w:space="0"/>
+            </w:tcBorders>
+            <w:shd w:val="clear" w:color="auto" w:fill="FFFFFF"/>
+            <w:vAlign w:val="center"/>
+          </w:tcPr>
+          <w:p>
+            <w:pPr>
+              <w:spacing w:after="0" w:line="240" w:lineRule="auto"/>
+              <w:rPr>
+                <w:rFonts w:hint="default" w:ascii="Times New Roman" w:hAnsi="Times New Roman" w:cs="Times New Roman"/>
+                <w:color w:val="000000"/>
+              </w:rPr>
+            </w:pPr>
+            <w:r>
+              <w:rPr>
+                <w:rFonts w:hint="default" w:ascii="Times New Roman" w:hAnsi="Times New Roman" w:cs="Times New Roman"/>
+                <w:color w:val="000000"/>
+              </w:rPr>
+              <w:t>HTML, CSS, and JavaScript console with live camera feed, classification card, metrics, events, and start/stop controls.</w:t>
+            </w:r>
+          </w:p>
+        </w:tc>
+      </w:tr>
+      <w:tr>
+        <w:tblPrEx>
+          <w:tblBorders>
+            <w:top w:val="single" w:color="auto" w:sz="4" w:space="0"/>
+            <w:left w:val="single" w:color="auto" w:sz="4" w:space="0"/>
+            <w:bottom w:val="single" w:color="auto" w:sz="4" w:space="0"/>
+            <w:right w:val="single" w:color="auto" w:sz="4" w:space="0"/>
+            <w:insideH w:val="single" w:color="auto" w:sz="4" w:space="0"/>
+            <w:insideV w:val="single" w:color="auto" w:sz="4" w:space="0"/>
+          </w:tblBorders>
+          <w:tblCellMar>
+            <w:top w:w="0" w:type="dxa"/>
+            <w:left w:w="108" w:type="dxa"/>
+            <w:bottom w:w="0" w:type="dxa"/>
+            <w:right w:w="108" w:type="dxa"/>
+          </w:tblCellMar>
+        </w:tblPrEx>
+        <w:trPr>
+          <w:jc w:val="center"/>
+        </w:trPr>
+        <w:tc>
+          <w:tcPr>
+            <w:tcW w:w="4968" w:type="dxa"/>
+            <w:tcBorders>
+              <w:top w:val="dotted" w:color="auto" w:sz="4" w:space="0"/>
+              <w:left w:val="dotted" w:color="auto" w:sz="4" w:space="0"/>
+              <w:bottom w:val="dotted" w:color="auto" w:sz="4" w:space="0"/>
+              <w:right w:val="dotted" w:color="auto" w:sz="4" w:space="0"/>
+            </w:tcBorders>
+            <w:shd w:val="clear" w:color="auto" w:fill="FFFFFF"/>
+            <w:vAlign w:val="center"/>
+          </w:tcPr>
+          <w:p>
+            <w:pPr>
+              <w:spacing w:after="0" w:line="240" w:lineRule="auto"/>
+              <w:rPr>
+                <w:rFonts w:hint="default" w:ascii="Times New Roman" w:hAnsi="Times New Roman" w:cs="Times New Roman"/>
+                <w:color w:val="000000"/>
+              </w:rPr>
+            </w:pPr>
+            <w:r>
+              <w:rPr>
+                <w:rFonts w:hint="default" w:ascii="Times New Roman" w:hAnsi="Times New Roman" w:cs="Times New Roman"/>
+                <w:color w:val="000000"/>
+              </w:rPr>
+              <w:t>Deployment</w:t>
+            </w:r>
+          </w:p>
+        </w:tc>
+        <w:tc>
+          <w:tcPr>
+            <w:tcW w:w="4968" w:type="dxa"/>
+            <w:tcBorders>
+              <w:top w:val="dotted" w:color="auto" w:sz="4" w:space="0"/>
+              <w:left w:val="dotted" w:color="auto" w:sz="4" w:space="0"/>
+              <w:bottom w:val="dotted" w:color="auto" w:sz="4" w:space="0"/>
+              <w:right w:val="dotted" w:color="auto" w:sz="4" w:space="0"/>
+            </w:tcBorders>
+            <w:shd w:val="clear" w:color="auto" w:fill="FFFFFF"/>
+            <w:vAlign w:val="center"/>
+          </w:tcPr>
+          <w:p>
+            <w:pPr>
+              <w:spacing w:after="0" w:line="240" w:lineRule="auto"/>
+              <w:rPr>
+                <w:rFonts w:hint="default" w:ascii="Times New Roman" w:hAnsi="Times New Roman" w:cs="Times New Roman"/>
+                <w:color w:val="000000"/>
+              </w:rPr>
+            </w:pPr>
+            <w:r>
+              <w:rPr>
+                <w:rFonts w:hint="default" w:ascii="Times New Roman" w:hAnsi="Times New Roman" w:cs="Times New Roman"/>
+                <w:color w:val="000000"/>
+              </w:rPr>
+              <w:t>Docker and compose configuration are included for repeatable local or edge deployment.</w:t>
+            </w:r>
+          </w:p>
+        </w:tc>
+      </w:tr>
+    </w:tbl>
+    <w:p>
+      <w:pPr>
+        <w:bidi w:val="0"/>
+        <w:rPr>
+          <w:rFonts w:hint="default"/>
+        </w:rPr>
+      </w:pPr>
+    </w:p>
+    <w:p>
+      <w:pPr>
+        <w:bidi w:val="0"/>
+        <w:rPr>
+          <w:rFonts w:hint="default" w:ascii="Times New Roman" w:hAnsi="Times New Roman" w:cs="Times New Roman"/>
+          <w:b/>
+          <w:bCs/>
+          <w:sz w:val="28"/>
+          <w:szCs w:val="28"/>
+        </w:rPr>
+      </w:pPr>
+      <w:r>
+        <w:rPr>
+          <w:rFonts w:hint="default" w:ascii="Times New Roman" w:hAnsi="Times New Roman" w:cs="Times New Roman"/>
+          <w:b/>
+          <w:bCs/>
+          <w:sz w:val="28"/>
+          <w:szCs w:val="28"/>
+        </w:rPr>
+        <w:t>System workflow</w:t>
+      </w:r>
+    </w:p>
+    <w:p>
+      <w:pPr>
+        <w:bidi w:val="0"/>
+        <w:rPr>
+          <w:rFonts w:hint="default"/>
+        </w:rPr>
+      </w:pPr>
+    </w:p>
+    <w:p>
+      <w:pPr>
         <w:pStyle w:val="10"/>
+        <w:rPr>
+          <w:rFonts w:hint="default" w:ascii="Times New Roman" w:hAnsi="Times New Roman" w:cs="Times New Roman"/>
+          <w:color w:val="auto"/>
+        </w:rPr>
+      </w:pPr>
+      <w:r>
+        <w:rPr>
+          <w:rFonts w:hint="default" w:ascii="Times New Roman" w:hAnsi="Times New Roman" w:cs="Times New Roman"/>
+          <w:color w:val="auto"/>
+        </w:rPr>
+        <w:t>Start: an operator starts the station from the dashboard.</w:t>
+      </w:r>
+    </w:p>
+    <w:p>
+      <w:pPr>
+        <w:pStyle w:val="10"/>
+        <w:rPr>
+          <w:rFonts w:hint="default" w:ascii="Times New Roman" w:hAnsi="Times New Roman" w:cs="Times New Roman"/>
+          <w:color w:val="auto"/>
+        </w:rPr>
+      </w:pPr>
+      <w:r>
+        <w:rPr>
+          <w:rFonts w:hint="default" w:ascii="Times New Roman" w:hAnsi="Times New Roman" w:cs="Times New Roman"/>
+          <w:color w:val="auto"/>
+        </w:rPr>
+        <w:t>Capture: the runtime opens the configured camera stream and continually reads frames.</w:t>
+      </w:r>
+    </w:p>
+    <w:p>
+      <w:pPr>
+        <w:pStyle w:val="10"/>
+        <w:rPr>
+          <w:rFonts w:hint="default" w:ascii="Times New Roman" w:hAnsi="Times New Roman" w:cs="Times New Roman"/>
+          <w:color w:val="auto"/>
+        </w:rPr>
+      </w:pPr>
+      <w:r>
+        <w:rPr>
+          <w:rFonts w:hint="default" w:ascii="Times New Roman" w:hAnsi="Times New Roman" w:cs="Times New Roman"/>
+          <w:color w:val="auto"/>
+        </w:rPr>
+        <w:t>Classify: approximately every 0.7 seconds, an available classifier predicts a label.</w:t>
+      </w:r>
+    </w:p>
+    <w:p>
+      <w:pPr>
+        <w:pStyle w:val="10"/>
+        <w:rPr>
+          <w:rFonts w:hint="default" w:ascii="Times New Roman" w:hAnsi="Times New Roman" w:cs="Times New Roman"/>
+          <w:color w:val="auto"/>
+        </w:rPr>
+      </w:pPr>
+      <w:r>
+        <w:rPr>
+          <w:rFonts w:hint="default" w:ascii="Times New Roman" w:hAnsi="Times New Roman" w:cs="Times New Roman"/>
+          <w:color w:val="auto"/>
+        </w:rPr>
+        <w:t>Record: the result and optional JPEG frame are written to the local database and frame directory.</w:t>
+      </w:r>
+    </w:p>
+    <w:p>
+      <w:pPr>
+        <w:pStyle w:val="10"/>
+        <w:rPr>
+          <w:rFonts w:hint="default" w:ascii="Times New Roman" w:hAnsi="Times New Roman" w:cs="Times New Roman"/>
+          <w:color w:val="auto"/>
+        </w:rPr>
+      </w:pPr>
+      <w:r>
+        <w:rPr>
+          <w:rFonts w:hint="default" w:ascii="Times New Roman" w:hAnsi="Times New Roman" w:cs="Times New Roman"/>
+          <w:color w:val="auto"/>
+        </w:rPr>
+        <w:t>Present: the API returns current state and recent events; the dashboard refreshes automatically.</w:t>
+      </w:r>
+    </w:p>
+    <w:p>
+      <w:pPr>
+        <w:pStyle w:val="10"/>
+        <w:rPr>
+          <w:rFonts w:hint="default" w:ascii="Times New Roman" w:hAnsi="Times New Roman" w:cs="Times New Roman"/>
+          <w:color w:val="auto"/>
+        </w:rPr>
+      </w:pPr>
+      <w:r>
+        <w:rPr>
+          <w:rFonts w:hint="default" w:ascii="Times New Roman" w:hAnsi="Times New Roman" w:cs="Times New Roman"/>
+          <w:color w:val="auto"/>
+        </w:rPr>
+        <w:t>Stop or failure: the camera is released, the runtime stops, and the dashboard reports the condition to the operator.</w:t>
+      </w:r>
+    </w:p>
+    <w:p>
+      <w:pPr>
+        <w:pStyle w:val="10"/>
+        <w:numPr>
+          <w:numId w:val="0"/>
+        </w:numPr>
+        <w:ind w:leftChars="-200"/>
+        <w:rPr>
+          <w:rFonts w:hint="default" w:ascii="Times New Roman" w:hAnsi="Times New Roman" w:cs="Times New Roman"/>
+          <w:color w:val="auto"/>
+        </w:rPr>
+      </w:pPr>
+    </w:p>
+    <w:p>
+      <w:pPr>
+        <w:bidi w:val="0"/>
+        <w:rPr>
+          <w:rFonts w:hint="default" w:ascii="Times New Roman" w:hAnsi="Times New Roman" w:cs="Times New Roman"/>
+          <w:b/>
+          <w:bCs/>
+          <w:sz w:val="28"/>
+          <w:szCs w:val="28"/>
+        </w:rPr>
+      </w:pPr>
+      <w:r>
+        <w:rPr>
+          <w:rFonts w:hint="default" w:ascii="Times New Roman" w:hAnsi="Times New Roman" w:cs="Times New Roman"/>
+          <w:b/>
+          <w:bCs/>
+          <w:sz w:val="28"/>
+          <w:szCs w:val="28"/>
+        </w:rPr>
+        <w:t>Dashboard overview</w:t>
+      </w:r>
+    </w:p>
+    <w:p>
+      <w:pPr>
+        <w:bidi w:val="0"/>
+        <w:rPr>
+          <w:rFonts w:hint="default"/>
+        </w:rPr>
+      </w:pPr>
+    </w:p>
+    <w:p>
+      <w:pPr>
+        <w:rPr>
+          <w:rFonts w:hint="default" w:ascii="Times New Roman" w:hAnsi="Times New Roman" w:cs="Times New Roman"/>
+          <w:color w:val="auto"/>
+        </w:rPr>
+      </w:pPr>
+      <w:r>
+        <w:rPr>
+          <w:rFonts w:hint="default" w:ascii="Times New Roman" w:hAnsi="Times New Roman" w:cs="Times New Roman"/>
+          <w:color w:val="auto"/>
+        </w:rPr>
+        <w:t xml:space="preserve">The dashboard is designed for a line operator or supervisor. It shows whether the station is running, whether the camera and classifier are ready, the current detected item and quality, total counts by quality, session uptime, and a </w:t>
+      </w:r>
+      <w:r>
+        <w:rPr>
+          <w:rFonts w:hint="default" w:ascii="Times New Roman" w:hAnsi="Times New Roman" w:cs="Times New Roman"/>
+          <w:color w:val="auto"/>
+          <w:lang w:val="en-ZA"/>
+        </w:rPr>
+        <w:t>real time</w:t>
+      </w:r>
+      <w:r>
+        <w:rPr>
+          <w:rFonts w:hint="default" w:ascii="Times New Roman" w:hAnsi="Times New Roman" w:cs="Times New Roman"/>
+          <w:color w:val="auto"/>
+        </w:rPr>
+        <w:t xml:space="preserve"> sorting report with saved frames. Start and Stop controls prevent conflicting requests and communicate service or camera errors clearly.</w:t>
+      </w:r>
+    </w:p>
+    <w:p>
+      <w:pPr>
+        <w:bidi w:val="0"/>
+        <w:rPr>
+          <w:rFonts w:hint="default"/>
+        </w:rPr>
+      </w:pPr>
+      <w:r>
+        <w:rPr>
+          <w:rFonts w:hint="default"/>
+        </w:rPr>
+        <w:t xml:space="preserve"> Data sources and model work</w:t>
+      </w:r>
+    </w:p>
+    <w:p>
+      <w:pPr>
+        <w:rPr>
+          <w:rFonts w:hint="default" w:ascii="Times New Roman" w:hAnsi="Times New Roman" w:cs="Times New Roman"/>
+          <w:color w:val="auto"/>
+        </w:rPr>
+      </w:pPr>
+      <w:r>
+        <w:rPr>
+          <w:rFonts w:hint="default" w:ascii="Times New Roman" w:hAnsi="Times New Roman" w:cs="Times New Roman"/>
+          <w:color w:val="auto"/>
+        </w:rPr>
+        <w:t xml:space="preserve">The project uses public fruit image datasets for model development, including the Fruit Ripeness Unripe Ripe and Rotten </w:t>
+      </w:r>
+      <w:r>
+        <w:rPr>
+          <w:rFonts w:hint="default" w:ascii="Times New Roman" w:hAnsi="Times New Roman" w:cs="Times New Roman"/>
+          <w:color w:val="auto"/>
+          <w:lang w:val="en-ZA"/>
+        </w:rPr>
+        <w:t>data set</w:t>
+      </w:r>
+      <w:r>
+        <w:rPr>
+          <w:rFonts w:hint="default" w:ascii="Times New Roman" w:hAnsi="Times New Roman" w:cs="Times New Roman"/>
+          <w:color w:val="auto"/>
+        </w:rPr>
+        <w:t xml:space="preserve"> and the Fruit and Vegetable Image Recognition </w:t>
+      </w:r>
+      <w:r>
+        <w:rPr>
+          <w:rFonts w:hint="default" w:ascii="Times New Roman" w:hAnsi="Times New Roman" w:cs="Times New Roman"/>
+          <w:color w:val="auto"/>
+          <w:lang w:val="en-ZA"/>
+        </w:rPr>
+        <w:t>data set</w:t>
+      </w:r>
+      <w:r>
+        <w:rPr>
+          <w:rFonts w:hint="default" w:ascii="Times New Roman" w:hAnsi="Times New Roman" w:cs="Times New Roman"/>
+          <w:color w:val="auto"/>
+        </w:rPr>
+        <w:t>. The repository contains trained model artifacts and notebooks documenting experimentation. Reported notebook results include a test accuracy of 95.59% for the described MobileNetV3-based ripeness experiment; production performance should still be measured against the target camera, lighting, fruit varieties, and deployment hardware.</w:t>
+      </w:r>
+    </w:p>
+    <w:p>
+      <w:pPr>
+        <w:rPr>
+          <w:rFonts w:hint="default" w:ascii="Times New Roman" w:hAnsi="Times New Roman" w:cs="Times New Roman"/>
+          <w:b/>
+          <w:bCs/>
+          <w:color w:val="auto"/>
+          <w:sz w:val="28"/>
+          <w:szCs w:val="28"/>
+        </w:rPr>
+      </w:pPr>
+    </w:p>
+    <w:p>
+      <w:pPr>
+        <w:rPr>
+          <w:rFonts w:hint="default" w:ascii="Times New Roman" w:hAnsi="Times New Roman" w:cs="Times New Roman"/>
+          <w:b/>
+          <w:bCs/>
+          <w:color w:val="auto"/>
+          <w:sz w:val="28"/>
+          <w:szCs w:val="28"/>
+          <w:lang w:val="en-ZA"/>
+        </w:rPr>
+      </w:pPr>
+      <w:r>
+        <w:rPr>
+          <w:rFonts w:hint="default" w:ascii="Times New Roman" w:hAnsi="Times New Roman" w:cs="Times New Roman"/>
+          <w:b/>
+          <w:bCs/>
+          <w:color w:val="auto"/>
+          <w:sz w:val="28"/>
+          <w:szCs w:val="28"/>
+          <w:lang w:val="en-ZA"/>
+        </w:rPr>
+        <w:t>Result Analysis</w:t>
+      </w:r>
+    </w:p>
+    <w:p>
+      <w:pPr>
+        <w:rPr>
+          <w:rFonts w:hint="default" w:ascii="Times New Roman" w:hAnsi="Times New Roman" w:cs="Times New Roman"/>
+          <w:b w:val="0"/>
+          <w:bCs w:val="0"/>
+          <w:color w:val="auto"/>
+          <w:sz w:val="24"/>
+          <w:szCs w:val="24"/>
+          <w:lang w:val="en-ZA"/>
+        </w:rPr>
+      </w:pPr>
+      <w:r>
+        <w:rPr>
+          <w:rFonts w:hint="default" w:ascii="Times New Roman" w:hAnsi="Times New Roman" w:cs="Times New Roman"/>
+          <w:b w:val="0"/>
+          <w:bCs w:val="0"/>
+          <w:color w:val="auto"/>
+          <w:sz w:val="24"/>
+          <w:szCs w:val="24"/>
+          <w:lang w:val="en-ZA"/>
+        </w:rPr>
+        <w:t>The test accuracy of the model is 95.59%</w:t>
+      </w:r>
+      <w:bookmarkStart w:id="0" w:name="_GoBack"/>
+      <w:bookmarkEnd w:id="0"/>
+    </w:p>
+    <w:p>
+      <w:pPr>
+        <w:rPr>
+          <w:rFonts w:hint="default" w:ascii="Times New Roman" w:hAnsi="Times New Roman" w:cs="Times New Roman"/>
+          <w:b/>
+          <w:bCs/>
+          <w:color w:val="auto"/>
+          <w:sz w:val="28"/>
+          <w:szCs w:val="28"/>
+          <w:lang w:val="en-ZA"/>
+        </w:rPr>
+      </w:pPr>
+    </w:p>
+    <w:p>
+      <w:pPr>
+        <w:rPr>
+          <w:rFonts w:hint="default" w:ascii="Times New Roman" w:hAnsi="Times New Roman" w:cs="Times New Roman"/>
+          <w:b w:val="0"/>
+          <w:bCs w:val="0"/>
+          <w:color w:val="auto"/>
+          <w:sz w:val="24"/>
+          <w:szCs w:val="24"/>
+          <w:lang w:val="en-ZA"/>
+        </w:rPr>
+      </w:pPr>
+    </w:p>
+    <w:p>
+      <w:pPr>
+        <w:rPr>
+          <w:rFonts w:hint="default" w:ascii="Times New Roman" w:hAnsi="Times New Roman" w:cs="Times New Roman"/>
+          <w:b/>
+          <w:bCs/>
+          <w:color w:val="auto"/>
+          <w:sz w:val="28"/>
+          <w:szCs w:val="28"/>
+        </w:rPr>
+      </w:pPr>
+    </w:p>
+    <w:p>
+      <w:pPr>
+        <w:rPr>
+          <w:rFonts w:hint="default" w:ascii="Times New Roman" w:hAnsi="Times New Roman" w:cs="Times New Roman"/>
+          <w:b/>
+          <w:bCs/>
+          <w:color w:val="auto"/>
+          <w:sz w:val="28"/>
+          <w:szCs w:val="28"/>
+        </w:rPr>
+      </w:pPr>
+    </w:p>
+    <w:p>
+      <w:pPr>
+        <w:bidi w:val="0"/>
+        <w:rPr>
+          <w:rFonts w:hint="default" w:ascii="Times New Roman" w:hAnsi="Times New Roman" w:cs="Times New Roman"/>
+          <w:b/>
+          <w:bCs/>
+          <w:sz w:val="28"/>
+          <w:szCs w:val="28"/>
+        </w:rPr>
+      </w:pPr>
+      <w:r>
+        <w:rPr>
+          <w:rFonts w:hint="default" w:ascii="Times New Roman" w:hAnsi="Times New Roman" w:cs="Times New Roman"/>
+          <w:b/>
+          <w:bCs/>
+          <w:sz w:val="28"/>
+          <w:szCs w:val="28"/>
+        </w:rPr>
+        <w:t>Limitations and next steps</w:t>
+      </w:r>
+    </w:p>
+    <w:p>
+      <w:pPr>
+        <w:bidi w:val="0"/>
+        <w:rPr>
+          <w:rFonts w:hint="default"/>
+        </w:rPr>
+      </w:pPr>
+    </w:p>
+    <w:p>
+      <w:pPr>
+        <w:pStyle w:val="10"/>
+        <w:rPr>
+          <w:rFonts w:hint="default" w:ascii="Times New Roman" w:hAnsi="Times New Roman" w:cs="Times New Roman"/>
+          <w:color w:val="auto"/>
+        </w:rPr>
+      </w:pPr>
+      <w:r>
+        <w:rPr>
+          <w:rFonts w:hint="default" w:ascii="Times New Roman" w:hAnsi="Times New Roman" w:cs="Times New Roman"/>
+          <w:color w:val="auto"/>
+        </w:rPr>
+        <w:t>The current runtime classifies frames and logs decisions but does not yet drive physical sorting actuators.</w:t>
+      </w:r>
+    </w:p>
+    <w:p>
+      <w:pPr>
+        <w:pStyle w:val="10"/>
+        <w:rPr>
+          <w:rFonts w:hint="default" w:ascii="Times New Roman" w:hAnsi="Times New Roman" w:cs="Times New Roman"/>
+          <w:color w:val="auto"/>
+        </w:rPr>
+      </w:pPr>
+      <w:r>
+        <w:rPr>
+          <w:rFonts w:hint="default" w:ascii="Times New Roman" w:hAnsi="Times New Roman" w:cs="Times New Roman"/>
+          <w:color w:val="auto"/>
+        </w:rPr>
+        <w:t>Accuracy and latency need validation on representative orchard and conveyor images.</w:t>
+      </w:r>
+    </w:p>
+    <w:p>
+      <w:pPr>
+        <w:pStyle w:val="10"/>
+        <w:rPr>
+          <w:rFonts w:hint="default" w:ascii="Times New Roman" w:hAnsi="Times New Roman" w:cs="Times New Roman"/>
+          <w:color w:val="auto"/>
+        </w:rPr>
+      </w:pPr>
+      <w:r>
+        <w:rPr>
+          <w:rFonts w:hint="default" w:ascii="Times New Roman" w:hAnsi="Times New Roman" w:cs="Times New Roman"/>
+          <w:color w:val="auto"/>
+        </w:rPr>
+        <w:t>Camera configuration, lighting, calibration, and model confidence thresholds should be made operator-configurable.</w:t>
+      </w:r>
+    </w:p>
+    <w:p>
+      <w:pPr>
+        <w:pStyle w:val="10"/>
+        <w:rPr>
+          <w:rFonts w:hint="default" w:ascii="Times New Roman" w:hAnsi="Times New Roman" w:cs="Times New Roman"/>
+          <w:color w:val="auto"/>
+        </w:rPr>
+      </w:pPr>
+      <w:r>
+        <w:rPr>
+          <w:rFonts w:hint="default" w:ascii="Times New Roman" w:hAnsi="Times New Roman" w:cs="Times New Roman"/>
+          <w:color w:val="auto"/>
+        </w:rPr>
+        <w:t>Add authenticated access and role-based controls before exposing the dashboard beyond a trusted local network.</w:t>
+      </w:r>
+    </w:p>
+    <w:p>
+      <w:pPr>
+        <w:pStyle w:val="10"/>
+        <w:rPr>
+          <w:rFonts w:hint="default" w:ascii="Times New Roman" w:hAnsi="Times New Roman" w:cs="Times New Roman"/>
+          <w:color w:val="auto"/>
+        </w:rPr>
+      </w:pPr>
+      <w:r>
+        <w:rPr>
+          <w:rFonts w:hint="default" w:ascii="Times New Roman" w:hAnsi="Times New Roman" w:cs="Times New Roman"/>
+          <w:color w:val="auto"/>
+        </w:rPr>
+        <w:t>Add exportable batch reports and monitoring for storage limits, camera failures, and model drift.</w:t>
+      </w:r>
+    </w:p>
+    <w:p>
+      <w:pPr>
+        <w:pStyle w:val="10"/>
+        <w:rPr>
+          <w:rFonts w:hint="default" w:ascii="Times New Roman" w:hAnsi="Times New Roman" w:cs="Times New Roman"/>
+          <w:color w:val="auto"/>
+        </w:rPr>
+      </w:pPr>
+      <w:r>
+        <w:rPr>
+          <w:rFonts w:hint="default" w:ascii="Times New Roman" w:hAnsi="Times New Roman" w:cs="Times New Roman"/>
+          <w:color w:val="auto"/>
+        </w:rPr>
+        <w:t>Integrate GPIO or another hardware interface for deterministic gate or relay control after classification validation.</w:t>
+      </w:r>
+    </w:p>
+    <w:p>
+      <w:pPr>
+        <w:pStyle w:val="10"/>
+        <w:numPr>
+          <w:numId w:val="0"/>
+        </w:numPr>
+        <w:ind w:leftChars="-200"/>
+        <w:rPr>
+          <w:rFonts w:hint="default" w:ascii="Times New Roman" w:hAnsi="Times New Roman" w:cs="Times New Roman"/>
+          <w:b/>
+          <w:bCs/>
+          <w:color w:val="auto"/>
+          <w:sz w:val="28"/>
+          <w:szCs w:val="28"/>
+        </w:rPr>
+      </w:pPr>
+    </w:p>
+    <w:p>
+      <w:pPr>
+        <w:bidi w:val="0"/>
+        <w:rPr>
+          <w:rFonts w:hint="default" w:ascii="Times New Roman" w:hAnsi="Times New Roman" w:cs="Times New Roman"/>
+          <w:b/>
+          <w:bCs/>
+          <w:sz w:val="28"/>
+          <w:szCs w:val="28"/>
+        </w:rPr>
+      </w:pPr>
+      <w:r>
+        <w:rPr>
+          <w:rFonts w:hint="default" w:ascii="Times New Roman" w:hAnsi="Times New Roman" w:cs="Times New Roman"/>
+          <w:b/>
+          <w:bCs/>
+          <w:sz w:val="28"/>
+          <w:szCs w:val="28"/>
+        </w:rPr>
+        <w:t>Conclusion</w:t>
+      </w:r>
+    </w:p>
+    <w:p>
+      <w:pPr>
+        <w:bidi w:val="0"/>
+        <w:rPr>
+          <w:rFonts w:hint="default"/>
+        </w:rPr>
+      </w:pPr>
+    </w:p>
+    <w:p>
+      <w:pPr>
+        <w:rPr>
+          <w:rFonts w:hint="default" w:ascii="Times New Roman" w:hAnsi="Times New Roman" w:cs="Times New Roman"/>
+          <w:color w:val="auto"/>
+        </w:rPr>
+      </w:pPr>
+      <w:r>
+        <w:rPr>
+          <w:rFonts w:hint="default" w:ascii="Times New Roman" w:hAnsi="Times New Roman" w:cs="Times New Roman"/>
+          <w:color w:val="auto"/>
+        </w:rPr>
+        <w:t>The Automated Fruit Sorter provides a working foundation for edge-based fruit quality inspection. Its current architecture connects camera capture, model inference, local event storage, and a live operator console in one deployable service. The next development priority is to validate the classifier in real operating conditions and then connect reliable classification decisions to physical sorting hardware.</w:t>
+      </w:r>
+    </w:p>
+    <w:p>
+      <w:pPr>
+        <w:pStyle w:val="11"/>
         <w:keepNext w:val="0"/>
         <w:keepLines w:val="0"/>
         <w:widowControl/>
@@ -6038,19 +7126,26 @@
           <w:lang w:val="en-ZA"/>
         </w:rPr>
       </w:pPr>
-      <w:r>
+    </w:p>
+    <w:p>
+      <w:pPr>
+        <w:pStyle w:val="11"/>
+        <w:keepNext w:val="0"/>
+        <w:keepLines w:val="0"/>
+        <w:widowControl/>
+        <w:suppressLineNumbers w:val="0"/>
+        <w:spacing w:line="240" w:lineRule="auto"/>
         <w:rPr>
           <w:rFonts w:hint="default" w:cs="Times New Roman"/>
           <w:b w:val="0"/>
           <w:bCs w:val="0"/>
           <w:lang w:val="en-ZA"/>
         </w:rPr>
-        <w:t xml:space="preserve"> Implementations </w:t>
-      </w:r>
-    </w:p>
-    <w:p>
-      <w:pPr>
-        <w:pStyle w:val="10"/>
+      </w:pPr>
+    </w:p>
+    <w:p>
+      <w:pPr>
+        <w:pStyle w:val="11"/>
         <w:keepNext w:val="0"/>
         <w:keepLines w:val="0"/>
         <w:widowControl/>
@@ -6063,60 +7158,60 @@
           <w:lang w:val="en-ZA"/>
         </w:rPr>
       </w:pPr>
-    </w:p>
-    <w:p>
-      <w:pPr>
-        <w:pStyle w:val="10"/>
-        <w:keepNext w:val="0"/>
-        <w:keepLines w:val="0"/>
-        <w:widowControl/>
-        <w:suppressLineNumbers w:val="0"/>
-        <w:spacing w:line="240" w:lineRule="auto"/>
+      <w:r>
         <w:rPr>
           <w:rFonts w:hint="default" w:cs="Times New Roman"/>
           <w:b w:val="0"/>
           <w:bCs w:val="0"/>
           <w:lang w:val="en-ZA"/>
         </w:rPr>
-      </w:pPr>
-      <w:r>
+        <w:t>Results analysis</w:t>
+      </w:r>
+    </w:p>
+    <w:p>
+      <w:pPr>
+        <w:pStyle w:val="11"/>
+        <w:keepNext w:val="0"/>
+        <w:keepLines w:val="0"/>
+        <w:widowControl/>
+        <w:suppressLineNumbers w:val="0"/>
+        <w:spacing w:line="240" w:lineRule="auto"/>
         <w:rPr>
           <w:rFonts w:hint="default" w:cs="Times New Roman"/>
           <w:b w:val="0"/>
           <w:bCs w:val="0"/>
           <w:lang w:val="en-ZA"/>
         </w:rPr>
-        <w:t xml:space="preserve">Conclusion </w:t>
-      </w:r>
-    </w:p>
-    <w:p>
-      <w:pPr>
-        <w:pStyle w:val="10"/>
-        <w:keepNext w:val="0"/>
-        <w:keepLines w:val="0"/>
-        <w:widowControl/>
-        <w:suppressLineNumbers w:val="0"/>
-        <w:spacing w:line="240" w:lineRule="auto"/>
+      </w:pPr>
+      <w:r>
         <w:rPr>
           <w:rFonts w:hint="default" w:cs="Times New Roman"/>
           <w:b w:val="0"/>
           <w:bCs w:val="0"/>
           <w:lang w:val="en-ZA"/>
         </w:rPr>
-      </w:pPr>
-      <w:r>
+        <w:t xml:space="preserve">Contribution to the body of knowledge </w:t>
+      </w:r>
+    </w:p>
+    <w:p>
+      <w:pPr>
+        <w:pStyle w:val="11"/>
+        <w:keepNext w:val="0"/>
+        <w:keepLines w:val="0"/>
+        <w:widowControl/>
+        <w:suppressLineNumbers w:val="0"/>
+        <w:spacing w:line="240" w:lineRule="auto"/>
         <w:rPr>
           <w:rFonts w:hint="default" w:cs="Times New Roman"/>
           <w:b w:val="0"/>
           <w:bCs w:val="0"/>
           <w:lang w:val="en-ZA"/>
         </w:rPr>
-        <w:t>Results analysis</w:t>
-      </w:r>
-    </w:p>
-    <w:p>
-      <w:pPr>
-        <w:pStyle w:val="10"/>
+      </w:pPr>
+    </w:p>
+    <w:p>
+      <w:pPr>
+        <w:pStyle w:val="11"/>
         <w:keepNext w:val="0"/>
         <w:keepLines w:val="0"/>
         <w:widowControl/>
@@ -6136,12 +7231,12 @@
           <w:bCs w:val="0"/>
           <w:lang w:val="en-ZA"/>
         </w:rPr>
-        <w:t xml:space="preserve">Contribution to the body of knowledge </w:t>
-      </w:r>
-    </w:p>
-    <w:p>
-      <w:pPr>
-        <w:pStyle w:val="10"/>
+        <w:t>References  (list)</w:t>
+      </w:r>
+    </w:p>
+    <w:p>
+      <w:pPr>
+        <w:pStyle w:val="11"/>
         <w:keepNext w:val="0"/>
         <w:keepLines w:val="0"/>
         <w:widowControl/>
@@ -6157,48 +7252,7 @@
     </w:p>
     <w:p>
       <w:pPr>
-        <w:pStyle w:val="10"/>
-        <w:keepNext w:val="0"/>
-        <w:keepLines w:val="0"/>
-        <w:widowControl/>
-        <w:suppressLineNumbers w:val="0"/>
-        <w:spacing w:line="240" w:lineRule="auto"/>
-        <w:rPr>
-          <w:rFonts w:hint="default" w:cs="Times New Roman"/>
-          <w:b w:val="0"/>
-          <w:bCs w:val="0"/>
-          <w:lang w:val="en-ZA"/>
-        </w:rPr>
-      </w:pPr>
-      <w:r>
-        <w:rPr>
-          <w:rFonts w:hint="default" w:cs="Times New Roman"/>
-          <w:b w:val="0"/>
-          <w:bCs w:val="0"/>
-          <w:lang w:val="en-ZA"/>
-        </w:rPr>
-        <w:t>References  (list)</w:t>
-      </w:r>
-    </w:p>
-    <w:p>
-      <w:pPr>
-        <w:pStyle w:val="10"/>
-        <w:keepNext w:val="0"/>
-        <w:keepLines w:val="0"/>
-        <w:widowControl/>
-        <w:suppressLineNumbers w:val="0"/>
-        <w:spacing w:line="240" w:lineRule="auto"/>
-        <w:rPr>
-          <w:rFonts w:hint="default" w:cs="Times New Roman"/>
-          <w:b w:val="0"/>
-          <w:bCs w:val="0"/>
-          <w:lang w:val="en-ZA"/>
-        </w:rPr>
-      </w:pPr>
-    </w:p>
-    <w:p>
-      <w:pPr>
-        <w:pStyle w:val="10"/>
+        <w:pStyle w:val="11"/>
         <w:keepNext w:val="0"/>
         <w:keepLines w:val="0"/>
         <w:widowControl/>
@@ -6563,16 +7617,40 @@
       </w:pPr>
     </w:lvl>
   </w:abstractNum>
+  <w:abstractNum w:abstractNumId="4">
+    <w:nsid w:val="7C08117D"/>
+    <w:multiLevelType w:val="singleLevel"/>
+    <w:tmpl w:val="7C08117D"/>
+    <w:lvl w:ilvl="0" w:tentative="0">
+      <w:start w:val="1"/>
+      <w:numFmt w:val="bullet"/>
+      <w:pStyle w:val="10"/>
+      <w:lvlText w:val=""/>
+      <w:lvlJc w:val="left"/>
+      <w:pPr>
+        <w:tabs>
+          <w:tab w:val="left" w:pos="360"/>
+        </w:tabs>
+        <w:ind w:left="360" w:hanging="360" w:hangingChars="200"/>
+      </w:pPr>
+      <w:rPr>
+        <w:rFonts w:hint="default" w:ascii="Wingdings" w:hAnsi="Wingdings"/>
+      </w:rPr>
+    </w:lvl>
+  </w:abstractNum>
   <w:num w:numId="1">
+    <w:abstractNumId w:val="4"/>
+  </w:num>
+  <w:num w:numId="2">
     <w:abstractNumId w:val="0"/>
   </w:num>
-  <w:num w:numId="2">
+  <w:num w:numId="3">
     <w:abstractNumId w:val="3"/>
   </w:num>
-  <w:num w:numId="3">
+  <w:num w:numId="4">
     <w:abstractNumId w:val="2"/>
   </w:num>
-  <w:num w:numId="4">
+  <w:num w:numId="5">
     <w:abstractNumId w:val="1"/>
   </w:num>
 </w:numbering>
@@ -6737,7 +7815,7 @@
     <w:lsdException w:unhideWhenUsed="0" w:uiPriority="0" w:semiHidden="0" w:name="Table Web 2"/>
     <w:lsdException w:unhideWhenUsed="0" w:uiPriority="0" w:semiHidden="0" w:name="Table Web 3"/>
     <w:lsdException w:unhideWhenUsed="0" w:uiPriority="0" w:semiHidden="0" w:name="Balloon Text"/>
-    <w:lsdException w:unhideWhenUsed="0" w:uiPriority="0" w:semiHidden="0" w:name="Table Grid"/>
+    <w:lsdException w:qFormat="1" w:unhideWhenUsed="0" w:uiPriority="59" w:semiHidden="0" w:name="Table Grid"/>
     <w:lsdException w:unhideWhenUsed="0" w:uiPriority="0" w:semiHidden="0" w:name="Table Theme"/>
     <w:lsdException w:unhideWhenUsed="0" w:uiPriority="60" w:semiHidden="0" w:name="Light Shading"/>
     <w:lsdException w:unhideWhenUsed="0" w:uiPriority="61" w:semiHidden="0" w:name="Light List"/>
@@ -6979,6 +8057,17 @@
     </w:rPr>
   </w:style>
   <w:style w:type="paragraph" w:styleId="10">
+    <w:name w:val="List Bullet"/>
+    <w:basedOn w:val="1"/>
+    <w:uiPriority w:val="0"/>
+    <w:pPr>
+      <w:numPr>
+        <w:ilvl w:val="0"/>
+        <w:numId w:val="1"/>
+      </w:numPr>
+    </w:pPr>
+  </w:style>
+  <w:style w:type="paragraph" w:styleId="11">
     <w:name w:val="Normal (Web)"/>
     <w:qFormat/>
     <w:uiPriority w:val="0"/>
@@ -6995,7 +8084,7 @@
       <w:lang w:val="en-US" w:eastAsia="zh-CN" w:bidi="ar"/>
     </w:rPr>
   </w:style>
-  <w:style w:type="character" w:styleId="11">
+  <w:style w:type="character" w:styleId="12">
     <w:name w:val="Strong"/>
     <w:basedOn w:val="7"/>
     <w:qFormat/>
@@ -7004,6 +8093,31 @@
       <w:b/>
       <w:bCs/>
     </w:rPr>
+  </w:style>
+  <w:style w:type="table" w:styleId="13">
+    <w:name w:val="Table Grid"/>
+    <w:basedOn w:val="8"/>
+    <w:qFormat/>
+    <w:uiPriority w:val="59"/>
+    <w:pPr>
+      <w:spacing w:after="0" w:line="240" w:lineRule="auto"/>
+    </w:pPr>
+    <w:tblPr>
+      <w:tblBorders>
+        <w:top w:val="single" w:color="auto" w:sz="4" w:space="0"/>
+        <w:left w:val="single" w:color="auto" w:sz="4" w:space="0"/>
+        <w:bottom w:val="single" w:color="auto" w:sz="4" w:space="0"/>
+        <w:right w:val="single" w:color="auto" w:sz="4" w:space="0"/>
+        <w:insideH w:val="single" w:color="auto" w:sz="4" w:space="0"/>
+        <w:insideV w:val="single" w:color="auto" w:sz="4" w:space="0"/>
+      </w:tblBorders>
+      <w:tblCellMar>
+        <w:top w:w="0" w:type="dxa"/>
+        <w:left w:w="108" w:type="dxa"/>
+        <w:bottom w:w="0" w:type="dxa"/>
+        <w:right w:w="108" w:type="dxa"/>
+      </w:tblCellMar>
+    </w:tblPr>
   </w:style>
 </w:styles>
 </file>

</xml_diff>